<commit_message>
Refine demo pointer and child learning cells
</commit_message>
<xml_diff>
--- a/data1/demo.docx
+++ b/data1/demo.docx
@@ -167,9 +167,6 @@
         <w:spacing w:after="60"/>
       </w:pPr>
       <w:r>
-        <w:rPr>
-          <w:sz w:val="21"/>
-        </w:rPr>
         <w:t>Working slide map for version 0.9230. Edit the wording here first; the Decision and detailed narrative below remain as previously written.</w:t>
       </w:r>
     </w:p>
@@ -188,846 +185,1511 @@
     <w:p>
       <w:pPr>
         <w:spacing w:after="60"/>
-      </w:pPr>
-      <w:r>
         <w:rPr>
           <w:b/>
-          <w:sz w:val="21"/>
+          <w:sz w:val="24"/>
+        </w:rPr>
+      </w:pPr>
+      <w:r>
+        <w:rPr>
+          <w:b/>
         </w:rPr>
         <w:t xml:space="preserve">INTRO 1.1  </w:t>
       </w:r>
       <w:r>
-        <w:rPr>
-          <w:sz w:val="21"/>
-        </w:rPr>
-        <w:t>Welcome to NourishlandXR — extended reality for exploring living landscapes.</w:t>
+        <w:t>Welcome to NourishlandXR — where extended reality brings plant stories</w:t>
+      </w:r>
+      <w:r>
+        <w:t xml:space="preserve"> and knowledge</w:t>
+      </w:r>
+      <w:r>
+        <w:t xml:space="preserve"> into living landscapes.</w:t>
+      </w:r>
+      <w:r>
+        <w:br/>
+      </w:r>
+      <w:r>
+        <w:br/>
       </w:r>
     </w:p>
+    <w:tbl>
+      <w:tblPr>
+        <w:tblW w:w="0" w:type="auto"/>
+        <w:tblCellSpacing w:w="15" w:type="dxa"/>
+        <w:tblCellMar>
+          <w:top w:w="15" w:type="dxa"/>
+          <w:left w:w="15" w:type="dxa"/>
+          <w:bottom w:w="15" w:type="dxa"/>
+          <w:right w:w="15" w:type="dxa"/>
+        </w:tblCellMar>
+        <w:tblLook w:val="04A0" w:firstRow="1" w:lastRow="0" w:firstColumn="1" w:lastColumn="0" w:noHBand="0" w:noVBand="1"/>
+      </w:tblPr>
+      <w:tblGrid>
+        <w:gridCol w:w="1326"/>
+        <w:gridCol w:w="8642"/>
+      </w:tblGrid>
+      <w:tr>
+        <w:trPr>
+          <w:tblHeader/>
+          <w:tblCellSpacing w:w="15" w:type="dxa"/>
+        </w:trPr>
+        <w:tc>
+          <w:tcPr>
+            <w:tcW w:w="0" w:type="auto"/>
+            <w:vAlign w:val="center"/>
+            <w:hideMark/>
+          </w:tcPr>
+          <w:p>
+            <w:pPr>
+              <w:spacing w:after="60"/>
+              <w:rPr>
+                <w:b/>
+                <w:bCs/>
+              </w:rPr>
+            </w:pPr>
+            <w:r>
+              <w:rPr>
+                <w:b/>
+                <w:bCs/>
+              </w:rPr>
+              <w:t>Step</w:t>
+            </w:r>
+          </w:p>
+        </w:tc>
+        <w:tc>
+          <w:tcPr>
+            <w:tcW w:w="0" w:type="auto"/>
+            <w:vAlign w:val="center"/>
+            <w:hideMark/>
+          </w:tcPr>
+          <w:p>
+            <w:pPr>
+              <w:spacing w:after="60"/>
+              <w:rPr>
+                <w:b/>
+                <w:bCs/>
+              </w:rPr>
+            </w:pPr>
+            <w:r>
+              <w:rPr>
+                <w:b/>
+                <w:bCs/>
+              </w:rPr>
+              <w:t>Suggested wording</w:t>
+            </w:r>
+          </w:p>
+        </w:tc>
+      </w:tr>
+      <w:tr>
+        <w:trPr>
+          <w:tblCellSpacing w:w="15" w:type="dxa"/>
+        </w:trPr>
+        <w:tc>
+          <w:tcPr>
+            <w:tcW w:w="0" w:type="auto"/>
+            <w:vAlign w:val="center"/>
+            <w:hideMark/>
+          </w:tcPr>
+          <w:p>
+            <w:pPr>
+              <w:spacing w:after="60"/>
+              <w:rPr>
+                <w:b/>
+              </w:rPr>
+            </w:pPr>
+            <w:r>
+              <w:rPr>
+                <w:b/>
+              </w:rPr>
+              <w:t>INTRO 1.1</w:t>
+            </w:r>
+          </w:p>
+        </w:tc>
+        <w:tc>
+          <w:tcPr>
+            <w:tcW w:w="0" w:type="auto"/>
+            <w:vAlign w:val="center"/>
+            <w:hideMark/>
+          </w:tcPr>
+          <w:p>
+            <w:pPr>
+              <w:spacing w:after="60"/>
+              <w:rPr>
+                <w:b/>
+              </w:rPr>
+            </w:pPr>
+            <w:r>
+              <w:rPr>
+                <w:b/>
+                <w:bCs/>
+              </w:rPr>
+              <w:t xml:space="preserve">Welcome to NourishlandXR — where extended reality brings plant stories </w:t>
+            </w:r>
+            <w:r>
+              <w:rPr>
+                <w:b/>
+                <w:bCs/>
+              </w:rPr>
+              <w:t xml:space="preserve">and knowledge </w:t>
+            </w:r>
+            <w:r>
+              <w:rPr>
+                <w:b/>
+                <w:bCs/>
+              </w:rPr>
+              <w:t>into living landscapes.</w:t>
+            </w:r>
+          </w:p>
+        </w:tc>
+      </w:tr>
+      <w:tr>
+        <w:trPr>
+          <w:tblCellSpacing w:w="15" w:type="dxa"/>
+        </w:trPr>
+        <w:tc>
+          <w:tcPr>
+            <w:tcW w:w="0" w:type="auto"/>
+            <w:vAlign w:val="center"/>
+            <w:hideMark/>
+          </w:tcPr>
+          <w:p>
+            <w:pPr>
+              <w:spacing w:after="60"/>
+              <w:rPr>
+                <w:b/>
+              </w:rPr>
+            </w:pPr>
+            <w:r>
+              <w:rPr>
+                <w:b/>
+              </w:rPr>
+              <w:t>INTRO 1.2</w:t>
+            </w:r>
+          </w:p>
+        </w:tc>
+        <w:tc>
+          <w:tcPr>
+            <w:tcW w:w="0" w:type="auto"/>
+            <w:vAlign w:val="center"/>
+            <w:hideMark/>
+          </w:tcPr>
+          <w:p>
+            <w:pPr>
+              <w:spacing w:after="60"/>
+              <w:rPr>
+                <w:b/>
+              </w:rPr>
+            </w:pPr>
+            <w:r>
+              <w:rPr>
+                <w:b/>
+                <w:bCs/>
+              </w:rPr>
+              <w:t>Extended reality connects digital information with the world around you. Here, plants and places become starting points for discovery and learning.</w:t>
+            </w:r>
+          </w:p>
+        </w:tc>
+      </w:tr>
+      <w:tr>
+        <w:trPr>
+          <w:tblCellSpacing w:w="15" w:type="dxa"/>
+        </w:trPr>
+        <w:tc>
+          <w:tcPr>
+            <w:tcW w:w="0" w:type="auto"/>
+            <w:vAlign w:val="center"/>
+            <w:hideMark/>
+          </w:tcPr>
+          <w:p>
+            <w:pPr>
+              <w:spacing w:after="60"/>
+              <w:rPr>
+                <w:b/>
+              </w:rPr>
+            </w:pPr>
+            <w:r>
+              <w:rPr>
+                <w:b/>
+              </w:rPr>
+              <w:t>SPACE 1.1</w:t>
+            </w:r>
+          </w:p>
+        </w:tc>
+        <w:tc>
+          <w:tcPr>
+            <w:tcW w:w="0" w:type="auto"/>
+            <w:vAlign w:val="center"/>
+            <w:hideMark/>
+          </w:tcPr>
+          <w:p>
+            <w:pPr>
+              <w:spacing w:after="60"/>
+              <w:rPr>
+                <w:b/>
+              </w:rPr>
+            </w:pPr>
+            <w:r>
+              <w:rPr>
+                <w:b/>
+                <w:bCs/>
+              </w:rPr>
+              <w:t>This is your Control Panel. It shows the actions and help available at each step.</w:t>
+            </w:r>
+          </w:p>
+        </w:tc>
+      </w:tr>
+      <w:tr>
+        <w:trPr>
+          <w:tblCellSpacing w:w="15" w:type="dxa"/>
+        </w:trPr>
+        <w:tc>
+          <w:tcPr>
+            <w:tcW w:w="0" w:type="auto"/>
+            <w:vAlign w:val="center"/>
+            <w:hideMark/>
+          </w:tcPr>
+          <w:p>
+            <w:pPr>
+              <w:spacing w:after="60"/>
+              <w:rPr>
+                <w:b/>
+              </w:rPr>
+            </w:pPr>
+            <w:r>
+              <w:rPr>
+                <w:b/>
+              </w:rPr>
+              <w:t>SPACE 1.2</w:t>
+            </w:r>
+          </w:p>
+        </w:tc>
+        <w:tc>
+          <w:tcPr>
+            <w:tcW w:w="0" w:type="auto"/>
+            <w:vAlign w:val="center"/>
+            <w:hideMark/>
+          </w:tcPr>
+          <w:p>
+            <w:pPr>
+              <w:spacing w:after="60"/>
+              <w:rPr>
+                <w:b/>
+              </w:rPr>
+            </w:pPr>
+            <w:r>
+              <w:rPr>
+                <w:b/>
+                <w:bCs/>
+              </w:rPr>
+              <w:t>You arrive in a garden. A plant catches your attention — what is it, and what role does it play here?</w:t>
+            </w:r>
+          </w:p>
+        </w:tc>
+      </w:tr>
+      <w:tr>
+        <w:trPr>
+          <w:tblCellSpacing w:w="15" w:type="dxa"/>
+        </w:trPr>
+        <w:tc>
+          <w:tcPr>
+            <w:tcW w:w="0" w:type="auto"/>
+            <w:vAlign w:val="center"/>
+            <w:hideMark/>
+          </w:tcPr>
+          <w:p>
+            <w:pPr>
+              <w:spacing w:after="60"/>
+              <w:rPr>
+                <w:b/>
+              </w:rPr>
+            </w:pPr>
+            <w:r>
+              <w:rPr>
+                <w:b/>
+              </w:rPr>
+              <w:t>SPACE 1.3</w:t>
+            </w:r>
+          </w:p>
+        </w:tc>
+        <w:tc>
+          <w:tcPr>
+            <w:tcW w:w="0" w:type="auto"/>
+            <w:vAlign w:val="center"/>
+            <w:hideMark/>
+          </w:tcPr>
+          <w:p>
+            <w:pPr>
+              <w:spacing w:after="60"/>
+              <w:rPr>
+                <w:b/>
+              </w:rPr>
+            </w:pPr>
+            <w:r>
+              <w:rPr>
+                <w:b/>
+                <w:bCs/>
+              </w:rPr>
+              <w:t>A Project brings together the plants, observations and guidance for a real place. Areas organise different parts of that place.</w:t>
+            </w:r>
+          </w:p>
+        </w:tc>
+      </w:tr>
+      <w:tr>
+        <w:trPr>
+          <w:tblCellSpacing w:w="15" w:type="dxa"/>
+        </w:trPr>
+        <w:tc>
+          <w:tcPr>
+            <w:tcW w:w="0" w:type="auto"/>
+            <w:vAlign w:val="center"/>
+            <w:hideMark/>
+          </w:tcPr>
+          <w:p>
+            <w:pPr>
+              <w:spacing w:after="60"/>
+              <w:rPr>
+                <w:b/>
+              </w:rPr>
+            </w:pPr>
+            <w:r>
+              <w:rPr>
+                <w:b/>
+              </w:rPr>
+              <w:t>SPACE 1.4</w:t>
+            </w:r>
+          </w:p>
+        </w:tc>
+        <w:tc>
+          <w:tcPr>
+            <w:tcW w:w="0" w:type="auto"/>
+            <w:vAlign w:val="center"/>
+            <w:hideMark/>
+          </w:tcPr>
+          <w:p>
+            <w:pPr>
+              <w:spacing w:after="60"/>
+              <w:rPr>
+                <w:b/>
+              </w:rPr>
+            </w:pPr>
+            <w:r>
+              <w:rPr>
+                <w:b/>
+                <w:bCs/>
+              </w:rPr>
+              <w:t>In this demo, you’ll explore two plants, add an observation and see how Areas connect.</w:t>
+            </w:r>
+          </w:p>
+        </w:tc>
+      </w:tr>
+      <w:tr>
+        <w:trPr>
+          <w:tblCellSpacing w:w="15" w:type="dxa"/>
+        </w:trPr>
+        <w:tc>
+          <w:tcPr>
+            <w:tcW w:w="0" w:type="auto"/>
+            <w:vAlign w:val="center"/>
+            <w:hideMark/>
+          </w:tcPr>
+          <w:p>
+            <w:pPr>
+              <w:spacing w:after="60"/>
+              <w:rPr>
+                <w:b/>
+              </w:rPr>
+            </w:pPr>
+            <w:r>
+              <w:rPr>
+                <w:b/>
+              </w:rPr>
+              <w:t>SPACE 1.5</w:t>
+            </w:r>
+          </w:p>
+        </w:tc>
+        <w:tc>
+          <w:tcPr>
+            <w:tcW w:w="0" w:type="auto"/>
+            <w:vAlign w:val="center"/>
+            <w:hideMark/>
+          </w:tcPr>
+          <w:p>
+            <w:pPr>
+              <w:spacing w:after="60"/>
+              <w:rPr>
+                <w:b/>
+              </w:rPr>
+            </w:pPr>
+            <w:r>
+              <w:rPr>
+                <w:b/>
+                <w:bCs/>
+              </w:rPr>
+              <w:t>The same place can support a visitor’s curiosity, a school activity or a land steward’s work.</w:t>
+            </w:r>
+          </w:p>
+        </w:tc>
+      </w:tr>
+      <w:tr>
+        <w:trPr>
+          <w:tblCellSpacing w:w="15" w:type="dxa"/>
+        </w:trPr>
+        <w:tc>
+          <w:tcPr>
+            <w:tcW w:w="0" w:type="auto"/>
+            <w:vAlign w:val="center"/>
+            <w:hideMark/>
+          </w:tcPr>
+          <w:p>
+            <w:pPr>
+              <w:spacing w:after="60"/>
+              <w:rPr>
+                <w:b/>
+              </w:rPr>
+            </w:pPr>
+            <w:r>
+              <w:rPr>
+                <w:b/>
+              </w:rPr>
+              <w:t>ELEMENTS 1.1</w:t>
+            </w:r>
+          </w:p>
+        </w:tc>
+        <w:tc>
+          <w:tcPr>
+            <w:tcW w:w="0" w:type="auto"/>
+            <w:vAlign w:val="center"/>
+            <w:hideMark/>
+          </w:tcPr>
+          <w:p>
+            <w:pPr>
+              <w:spacing w:after="60"/>
+              <w:rPr>
+                <w:b/>
+              </w:rPr>
+            </w:pPr>
+            <w:r>
+              <w:rPr>
+                <w:b/>
+                <w:bCs/>
+              </w:rPr>
+              <w:t>A plant profile brings together its identity, ecology, care and uses, alongside local knowledge and sources.</w:t>
+            </w:r>
+          </w:p>
+        </w:tc>
+      </w:tr>
+      <w:tr>
+        <w:trPr>
+          <w:tblCellSpacing w:w="15" w:type="dxa"/>
+        </w:trPr>
+        <w:tc>
+          <w:tcPr>
+            <w:tcW w:w="0" w:type="auto"/>
+            <w:vAlign w:val="center"/>
+            <w:hideMark/>
+          </w:tcPr>
+          <w:p>
+            <w:pPr>
+              <w:spacing w:after="60"/>
+              <w:rPr>
+                <w:b/>
+              </w:rPr>
+            </w:pPr>
+            <w:r>
+              <w:rPr>
+                <w:b/>
+              </w:rPr>
+              <w:t>ELEMENTS 1.2</w:t>
+            </w:r>
+          </w:p>
+        </w:tc>
+        <w:tc>
+          <w:tcPr>
+            <w:tcW w:w="0" w:type="auto"/>
+            <w:vAlign w:val="center"/>
+            <w:hideMark/>
+          </w:tcPr>
+          <w:p>
+            <w:pPr>
+              <w:spacing w:after="60"/>
+              <w:rPr>
+                <w:b/>
+              </w:rPr>
+            </w:pPr>
+            <w:r>
+              <w:rPr>
+                <w:b/>
+                <w:bCs/>
+              </w:rPr>
+              <w:t>Totem signs help you find your way through an Area, pointing towards plants, Notes and other Areas.</w:t>
+            </w:r>
+          </w:p>
+        </w:tc>
+      </w:tr>
+      <w:tr>
+        <w:trPr>
+          <w:tblCellSpacing w:w="15" w:type="dxa"/>
+        </w:trPr>
+        <w:tc>
+          <w:tcPr>
+            <w:tcW w:w="0" w:type="auto"/>
+            <w:vAlign w:val="center"/>
+            <w:hideMark/>
+          </w:tcPr>
+          <w:p>
+            <w:pPr>
+              <w:spacing w:after="60"/>
+              <w:rPr>
+                <w:b/>
+              </w:rPr>
+            </w:pPr>
+            <w:r>
+              <w:rPr>
+                <w:b/>
+              </w:rPr>
+              <w:t>ELEMENTS 1.3</w:t>
+            </w:r>
+          </w:p>
+        </w:tc>
+        <w:tc>
+          <w:tcPr>
+            <w:tcW w:w="0" w:type="auto"/>
+            <w:vAlign w:val="center"/>
+            <w:hideMark/>
+          </w:tcPr>
+          <w:p>
+            <w:pPr>
+              <w:spacing w:after="60"/>
+              <w:rPr>
+                <w:b/>
+              </w:rPr>
+            </w:pPr>
+            <w:r>
+              <w:rPr>
+                <w:b/>
+                <w:bCs/>
+              </w:rPr>
+              <w:t>Start with Pigeon Pea. Aim at the plant, or choose a location for its digital tag.</w:t>
+            </w:r>
+          </w:p>
+        </w:tc>
+      </w:tr>
+      <w:tr>
+        <w:trPr>
+          <w:tblCellSpacing w:w="15" w:type="dxa"/>
+        </w:trPr>
+        <w:tc>
+          <w:tcPr>
+            <w:tcW w:w="0" w:type="auto"/>
+            <w:vAlign w:val="center"/>
+            <w:hideMark/>
+          </w:tcPr>
+          <w:p>
+            <w:pPr>
+              <w:spacing w:after="60"/>
+              <w:rPr>
+                <w:b/>
+              </w:rPr>
+            </w:pPr>
+            <w:r>
+              <w:rPr>
+                <w:b/>
+              </w:rPr>
+              <w:t>ELEMENTS 1.4</w:t>
+            </w:r>
+          </w:p>
+        </w:tc>
+        <w:tc>
+          <w:tcPr>
+            <w:tcW w:w="0" w:type="auto"/>
+            <w:vAlign w:val="center"/>
+            <w:hideMark/>
+          </w:tcPr>
+          <w:p>
+            <w:pPr>
+              <w:spacing w:after="60"/>
+              <w:rPr>
+                <w:b/>
+              </w:rPr>
+            </w:pPr>
+            <w:r>
+              <w:rPr>
+                <w:b/>
+                <w:bCs/>
+              </w:rPr>
+              <w:t>The tag connects this plant profile to a location in the landscape.</w:t>
+            </w:r>
+          </w:p>
+        </w:tc>
+      </w:tr>
+      <w:tr>
+        <w:trPr>
+          <w:tblCellSpacing w:w="15" w:type="dxa"/>
+        </w:trPr>
+        <w:tc>
+          <w:tcPr>
+            <w:tcW w:w="0" w:type="auto"/>
+            <w:vAlign w:val="center"/>
+            <w:hideMark/>
+          </w:tcPr>
+          <w:p>
+            <w:pPr>
+              <w:spacing w:after="60"/>
+              <w:rPr>
+                <w:b/>
+              </w:rPr>
+            </w:pPr>
+            <w:r>
+              <w:rPr>
+                <w:b/>
+              </w:rPr>
+              <w:t>ELEMENTS 1.5</w:t>
+            </w:r>
+          </w:p>
+        </w:tc>
+        <w:tc>
+          <w:tcPr>
+            <w:tcW w:w="0" w:type="auto"/>
+            <w:vAlign w:val="center"/>
+            <w:hideMark/>
+          </w:tcPr>
+          <w:p>
+            <w:pPr>
+              <w:spacing w:after="60"/>
+              <w:rPr>
+                <w:b/>
+              </w:rPr>
+            </w:pPr>
+            <w:r>
+              <w:rPr>
+                <w:b/>
+                <w:bCs/>
+              </w:rPr>
+              <w:t>Adjust the tag’s distance, then confirm its position.</w:t>
+            </w:r>
+          </w:p>
+        </w:tc>
+      </w:tr>
+      <w:tr>
+        <w:trPr>
+          <w:tblCellSpacing w:w="15" w:type="dxa"/>
+        </w:trPr>
+        <w:tc>
+          <w:tcPr>
+            <w:tcW w:w="0" w:type="auto"/>
+            <w:vAlign w:val="center"/>
+            <w:hideMark/>
+          </w:tcPr>
+          <w:p>
+            <w:pPr>
+              <w:spacing w:after="60"/>
+              <w:rPr>
+                <w:b/>
+              </w:rPr>
+            </w:pPr>
+            <w:r>
+              <w:rPr>
+                <w:b/>
+              </w:rPr>
+              <w:t>ELEMENTS 1.6</w:t>
+            </w:r>
+          </w:p>
+        </w:tc>
+        <w:tc>
+          <w:tcPr>
+            <w:tcW w:w="0" w:type="auto"/>
+            <w:vAlign w:val="center"/>
+            <w:hideMark/>
+          </w:tcPr>
+          <w:p>
+            <w:pPr>
+              <w:spacing w:after="60"/>
+              <w:rPr>
+                <w:b/>
+              </w:rPr>
+            </w:pPr>
+            <w:r>
+              <w:rPr>
+                <w:b/>
+                <w:bCs/>
+              </w:rPr>
+              <w:t>This digital tag is a Plant Orb. Select it to open the plant profile, or hold it to move it.</w:t>
+            </w:r>
+          </w:p>
+        </w:tc>
+      </w:tr>
+      <w:tr>
+        <w:trPr>
+          <w:tblCellSpacing w:w="15" w:type="dxa"/>
+        </w:trPr>
+        <w:tc>
+          <w:tcPr>
+            <w:tcW w:w="0" w:type="auto"/>
+            <w:vAlign w:val="center"/>
+            <w:hideMark/>
+          </w:tcPr>
+          <w:p>
+            <w:pPr>
+              <w:spacing w:after="60"/>
+              <w:rPr>
+                <w:b/>
+              </w:rPr>
+            </w:pPr>
+            <w:r>
+              <w:rPr>
+                <w:b/>
+              </w:rPr>
+              <w:t>ELEMENTS 1.7</w:t>
+            </w:r>
+          </w:p>
+        </w:tc>
+        <w:tc>
+          <w:tcPr>
+            <w:tcW w:w="0" w:type="auto"/>
+            <w:vAlign w:val="center"/>
+            <w:hideMark/>
+          </w:tcPr>
+          <w:p>
+            <w:pPr>
+              <w:spacing w:after="60"/>
+              <w:rPr>
+                <w:b/>
+              </w:rPr>
+            </w:pPr>
+            <w:r>
+              <w:rPr>
+                <w:b/>
+                <w:bCs/>
+              </w:rPr>
+              <w:t>Explore Pigeon Pea’s information cells to discover its characteristics and roles.</w:t>
+            </w:r>
+          </w:p>
+        </w:tc>
+      </w:tr>
+      <w:tr>
+        <w:trPr>
+          <w:tblCellSpacing w:w="15" w:type="dxa"/>
+        </w:trPr>
+        <w:tc>
+          <w:tcPr>
+            <w:tcW w:w="0" w:type="auto"/>
+            <w:vAlign w:val="center"/>
+            <w:hideMark/>
+          </w:tcPr>
+          <w:p>
+            <w:pPr>
+              <w:spacing w:after="60"/>
+              <w:rPr>
+                <w:b/>
+              </w:rPr>
+            </w:pPr>
+            <w:r>
+              <w:rPr>
+                <w:b/>
+              </w:rPr>
+              <w:t>ELEMENTS 1.8</w:t>
+            </w:r>
+          </w:p>
+        </w:tc>
+        <w:tc>
+          <w:tcPr>
+            <w:tcW w:w="0" w:type="auto"/>
+            <w:vAlign w:val="center"/>
+            <w:hideMark/>
+          </w:tcPr>
+          <w:p>
+            <w:pPr>
+              <w:spacing w:after="60"/>
+              <w:rPr>
+                <w:b/>
+              </w:rPr>
+            </w:pPr>
+            <w:r>
+              <w:rPr>
+                <w:b/>
+                <w:bCs/>
+              </w:rPr>
+              <w:t>The same plant profile is also available in Web Mode, as a standard browser page.</w:t>
+            </w:r>
+          </w:p>
+        </w:tc>
+      </w:tr>
+      <w:tr>
+        <w:trPr>
+          <w:tblCellSpacing w:w="15" w:type="dxa"/>
+        </w:trPr>
+        <w:tc>
+          <w:tcPr>
+            <w:tcW w:w="0" w:type="auto"/>
+            <w:vAlign w:val="center"/>
+            <w:hideMark/>
+          </w:tcPr>
+          <w:p>
+            <w:pPr>
+              <w:spacing w:after="60"/>
+              <w:rPr>
+                <w:b/>
+              </w:rPr>
+            </w:pPr>
+            <w:r>
+              <w:rPr>
+                <w:b/>
+              </w:rPr>
+              <w:t>ELEMENTS 1.9</w:t>
+            </w:r>
+          </w:p>
+        </w:tc>
+        <w:tc>
+          <w:tcPr>
+            <w:tcW w:w="0" w:type="auto"/>
+            <w:vAlign w:val="center"/>
+            <w:hideMark/>
+          </w:tcPr>
+          <w:p>
+            <w:pPr>
+              <w:spacing w:after="60"/>
+              <w:rPr>
+                <w:b/>
+              </w:rPr>
+            </w:pPr>
+            <w:r>
+              <w:rPr>
+                <w:b/>
+                <w:bCs/>
+              </w:rPr>
+              <w:t>Which of these characteristics could matter in this garden? Keep one in mind as you explore.</w:t>
+            </w:r>
+          </w:p>
+        </w:tc>
+      </w:tr>
+      <w:tr>
+        <w:trPr>
+          <w:tblCellSpacing w:w="15" w:type="dxa"/>
+        </w:trPr>
+        <w:tc>
+          <w:tcPr>
+            <w:tcW w:w="0" w:type="auto"/>
+            <w:vAlign w:val="center"/>
+            <w:hideMark/>
+          </w:tcPr>
+          <w:p>
+            <w:pPr>
+              <w:spacing w:after="60"/>
+              <w:rPr>
+                <w:b/>
+              </w:rPr>
+            </w:pPr>
+            <w:r>
+              <w:rPr>
+                <w:b/>
+              </w:rPr>
+              <w:t>ELEMENTS 1.10</w:t>
+            </w:r>
+          </w:p>
+        </w:tc>
+        <w:tc>
+          <w:tcPr>
+            <w:tcW w:w="0" w:type="auto"/>
+            <w:vAlign w:val="center"/>
+            <w:hideMark/>
+          </w:tcPr>
+          <w:p>
+            <w:pPr>
+              <w:spacing w:after="60"/>
+              <w:rPr>
+                <w:b/>
+              </w:rPr>
+            </w:pPr>
+            <w:r>
+              <w:rPr>
+                <w:b/>
+                <w:bCs/>
+              </w:rPr>
+              <w:t>Now meet Moringa. Compare its characteristics with Pigeon Pea and consider the different roles they might play here.</w:t>
+            </w:r>
+          </w:p>
+        </w:tc>
+      </w:tr>
+      <w:tr>
+        <w:trPr>
+          <w:tblCellSpacing w:w="15" w:type="dxa"/>
+        </w:trPr>
+        <w:tc>
+          <w:tcPr>
+            <w:tcW w:w="0" w:type="auto"/>
+            <w:vAlign w:val="center"/>
+            <w:hideMark/>
+          </w:tcPr>
+          <w:p>
+            <w:pPr>
+              <w:spacing w:after="60"/>
+              <w:rPr>
+                <w:b/>
+              </w:rPr>
+            </w:pPr>
+            <w:r>
+              <w:rPr>
+                <w:b/>
+              </w:rPr>
+              <w:t>ELEMENTS 1.12</w:t>
+            </w:r>
+          </w:p>
+        </w:tc>
+        <w:tc>
+          <w:tcPr>
+            <w:tcW w:w="0" w:type="auto"/>
+            <w:vAlign w:val="center"/>
+            <w:hideMark/>
+          </w:tcPr>
+          <w:p>
+            <w:pPr>
+              <w:spacing w:after="60"/>
+              <w:rPr>
+                <w:b/>
+              </w:rPr>
+            </w:pPr>
+            <w:r>
+              <w:rPr>
+                <w:b/>
+                <w:bCs/>
+              </w:rPr>
+              <w:t>Both plant profiles are now linked to this place, ready to explore and compare.</w:t>
+            </w:r>
+          </w:p>
+        </w:tc>
+      </w:tr>
+      <w:tr>
+        <w:trPr>
+          <w:tblCellSpacing w:w="15" w:type="dxa"/>
+        </w:trPr>
+        <w:tc>
+          <w:tcPr>
+            <w:tcW w:w="0" w:type="auto"/>
+            <w:vAlign w:val="center"/>
+            <w:hideMark/>
+          </w:tcPr>
+          <w:p>
+            <w:pPr>
+              <w:spacing w:after="60"/>
+              <w:rPr>
+                <w:b/>
+              </w:rPr>
+            </w:pPr>
+            <w:r>
+              <w:rPr>
+                <w:b/>
+              </w:rPr>
+              <w:t>ELEMENTS 1.14</w:t>
+            </w:r>
+          </w:p>
+        </w:tc>
+        <w:tc>
+          <w:tcPr>
+            <w:tcW w:w="0" w:type="auto"/>
+            <w:vAlign w:val="center"/>
+            <w:hideMark/>
+          </w:tcPr>
+          <w:p>
+            <w:pPr>
+              <w:spacing w:after="60"/>
+              <w:rPr>
+                <w:b/>
+              </w:rPr>
+            </w:pPr>
+            <w:r>
+              <w:rPr>
+                <w:b/>
+                <w:bCs/>
+              </w:rPr>
+              <w:t>What do you notice in the actual landscape?</w:t>
+            </w:r>
+          </w:p>
+        </w:tc>
+      </w:tr>
+      <w:tr>
+        <w:trPr>
+          <w:tblCellSpacing w:w="15" w:type="dxa"/>
+        </w:trPr>
+        <w:tc>
+          <w:tcPr>
+            <w:tcW w:w="0" w:type="auto"/>
+            <w:vAlign w:val="center"/>
+            <w:hideMark/>
+          </w:tcPr>
+          <w:p>
+            <w:pPr>
+              <w:spacing w:after="60"/>
+              <w:rPr>
+                <w:b/>
+              </w:rPr>
+            </w:pPr>
+            <w:r>
+              <w:rPr>
+                <w:b/>
+              </w:rPr>
+              <w:t>ELEMENTS 1.15</w:t>
+            </w:r>
+          </w:p>
+        </w:tc>
+        <w:tc>
+          <w:tcPr>
+            <w:tcW w:w="0" w:type="auto"/>
+            <w:vAlign w:val="center"/>
+            <w:hideMark/>
+          </w:tcPr>
+          <w:p>
+            <w:pPr>
+              <w:spacing w:after="60"/>
+              <w:rPr>
+                <w:b/>
+              </w:rPr>
+            </w:pPr>
+            <w:r>
+              <w:rPr>
+                <w:b/>
+                <w:bCs/>
+              </w:rPr>
+              <w:t>Create a Note to record an observation.</w:t>
+            </w:r>
+          </w:p>
+        </w:tc>
+      </w:tr>
+      <w:tr>
+        <w:trPr>
+          <w:tblCellSpacing w:w="15" w:type="dxa"/>
+        </w:trPr>
+        <w:tc>
+          <w:tcPr>
+            <w:tcW w:w="0" w:type="auto"/>
+            <w:vAlign w:val="center"/>
+            <w:hideMark/>
+          </w:tcPr>
+          <w:p>
+            <w:pPr>
+              <w:spacing w:after="60"/>
+              <w:rPr>
+                <w:b/>
+              </w:rPr>
+            </w:pPr>
+            <w:r>
+              <w:rPr>
+                <w:b/>
+              </w:rPr>
+              <w:t>ELEMENTS 1.17</w:t>
+            </w:r>
+          </w:p>
+        </w:tc>
+        <w:tc>
+          <w:tcPr>
+            <w:tcW w:w="0" w:type="auto"/>
+            <w:vAlign w:val="center"/>
+            <w:hideMark/>
+          </w:tcPr>
+          <w:p>
+            <w:pPr>
+              <w:spacing w:after="60"/>
+              <w:rPr>
+                <w:b/>
+              </w:rPr>
+            </w:pPr>
+            <w:r>
+              <w:rPr>
+                <w:b/>
+                <w:bCs/>
+              </w:rPr>
+              <w:t>Your Note now belongs to this location. It can hold an observation, image, memory or task.</w:t>
+            </w:r>
+          </w:p>
+        </w:tc>
+      </w:tr>
+      <w:tr>
+        <w:trPr>
+          <w:tblCellSpacing w:w="15" w:type="dxa"/>
+        </w:trPr>
+        <w:tc>
+          <w:tcPr>
+            <w:tcW w:w="0" w:type="auto"/>
+            <w:vAlign w:val="center"/>
+            <w:hideMark/>
+          </w:tcPr>
+          <w:p>
+            <w:pPr>
+              <w:spacing w:after="60"/>
+              <w:rPr>
+                <w:b/>
+              </w:rPr>
+            </w:pPr>
+            <w:r>
+              <w:rPr>
+                <w:b/>
+              </w:rPr>
+              <w:t>ELEMENTS 1.18</w:t>
+            </w:r>
+          </w:p>
+        </w:tc>
+        <w:tc>
+          <w:tcPr>
+            <w:tcW w:w="0" w:type="auto"/>
+            <w:vAlign w:val="center"/>
+            <w:hideMark/>
+          </w:tcPr>
+          <w:p>
+            <w:pPr>
+              <w:spacing w:after="60"/>
+              <w:rPr>
+                <w:b/>
+              </w:rPr>
+            </w:pPr>
+            <w:r>
+              <w:rPr>
+                <w:b/>
+                <w:bCs/>
+              </w:rPr>
+              <w:t>This Totem introduces the Area and points to nearby content. Use Show Signs to reveal its directions, or Fade to reduce its visibility.</w:t>
+            </w:r>
+          </w:p>
+        </w:tc>
+      </w:tr>
+      <w:tr>
+        <w:trPr>
+          <w:tblCellSpacing w:w="15" w:type="dxa"/>
+        </w:trPr>
+        <w:tc>
+          <w:tcPr>
+            <w:tcW w:w="0" w:type="auto"/>
+            <w:vAlign w:val="center"/>
+            <w:hideMark/>
+          </w:tcPr>
+          <w:p>
+            <w:pPr>
+              <w:spacing w:after="60"/>
+              <w:rPr>
+                <w:b/>
+              </w:rPr>
+            </w:pPr>
+            <w:r>
+              <w:rPr>
+                <w:b/>
+              </w:rPr>
+              <w:t>ELEMENTS 1.21</w:t>
+            </w:r>
+          </w:p>
+        </w:tc>
+        <w:tc>
+          <w:tcPr>
+            <w:tcW w:w="0" w:type="auto"/>
+            <w:vAlign w:val="center"/>
+            <w:hideMark/>
+          </w:tcPr>
+          <w:p>
+            <w:pPr>
+              <w:spacing w:after="60"/>
+              <w:rPr>
+                <w:b/>
+              </w:rPr>
+            </w:pPr>
+            <w:r>
+              <w:rPr>
+                <w:b/>
+                <w:bCs/>
+              </w:rPr>
+              <w:t>A route connects the two Areas. Each keeps its own plants and Notes.</w:t>
+            </w:r>
+          </w:p>
+        </w:tc>
+      </w:tr>
+      <w:tr>
+        <w:trPr>
+          <w:tblCellSpacing w:w="15" w:type="dxa"/>
+        </w:trPr>
+        <w:tc>
+          <w:tcPr>
+            <w:tcW w:w="0" w:type="auto"/>
+            <w:vAlign w:val="center"/>
+            <w:hideMark/>
+          </w:tcPr>
+          <w:p>
+            <w:pPr>
+              <w:spacing w:after="60"/>
+              <w:rPr>
+                <w:b/>
+              </w:rPr>
+            </w:pPr>
+            <w:r>
+              <w:rPr>
+                <w:b/>
+              </w:rPr>
+              <w:t>ELEMENTS 1.22</w:t>
+            </w:r>
+          </w:p>
+        </w:tc>
+        <w:tc>
+          <w:tcPr>
+            <w:tcW w:w="0" w:type="auto"/>
+            <w:vAlign w:val="center"/>
+            <w:hideMark/>
+          </w:tcPr>
+          <w:p>
+            <w:pPr>
+              <w:spacing w:after="60"/>
+              <w:rPr>
+                <w:b/>
+              </w:rPr>
+            </w:pPr>
+            <w:r>
+              <w:rPr>
+                <w:b/>
+                <w:bCs/>
+              </w:rPr>
+              <w:t>Linked Areas can form a garden tour, a learning trail or a route through a working landscape.</w:t>
+            </w:r>
+          </w:p>
+        </w:tc>
+      </w:tr>
+      <w:tr>
+        <w:trPr>
+          <w:tblCellSpacing w:w="15" w:type="dxa"/>
+        </w:trPr>
+        <w:tc>
+          <w:tcPr>
+            <w:tcW w:w="0" w:type="auto"/>
+            <w:vAlign w:val="center"/>
+            <w:hideMark/>
+          </w:tcPr>
+          <w:p>
+            <w:pPr>
+              <w:spacing w:after="60"/>
+              <w:rPr>
+                <w:b/>
+              </w:rPr>
+            </w:pPr>
+            <w:r>
+              <w:rPr>
+                <w:b/>
+              </w:rPr>
+              <w:t>LEARNING 1.7</w:t>
+            </w:r>
+          </w:p>
+        </w:tc>
+        <w:tc>
+          <w:tcPr>
+            <w:tcW w:w="0" w:type="auto"/>
+            <w:vAlign w:val="center"/>
+            <w:hideMark/>
+          </w:tcPr>
+          <w:p>
+            <w:pPr>
+              <w:spacing w:after="60"/>
+              <w:rPr>
+                <w:b/>
+              </w:rPr>
+            </w:pPr>
+            <w:r>
+              <w:rPr>
+                <w:b/>
+                <w:bCs/>
+              </w:rPr>
+              <w:t>Choose a learning pathway and explore the questions within it.</w:t>
+            </w:r>
+          </w:p>
+        </w:tc>
+      </w:tr>
+      <w:tr>
+        <w:trPr>
+          <w:tblCellSpacing w:w="15" w:type="dxa"/>
+        </w:trPr>
+        <w:tc>
+          <w:tcPr>
+            <w:tcW w:w="0" w:type="auto"/>
+            <w:vAlign w:val="center"/>
+            <w:hideMark/>
+          </w:tcPr>
+          <w:p>
+            <w:pPr>
+              <w:spacing w:after="60"/>
+              <w:rPr>
+                <w:b/>
+              </w:rPr>
+            </w:pPr>
+            <w:r>
+              <w:rPr>
+                <w:b/>
+              </w:rPr>
+              <w:t>LEARNING 1.8</w:t>
+            </w:r>
+          </w:p>
+        </w:tc>
+        <w:tc>
+          <w:tcPr>
+            <w:tcW w:w="0" w:type="auto"/>
+            <w:vAlign w:val="center"/>
+            <w:hideMark/>
+          </w:tcPr>
+          <w:p>
+            <w:pPr>
+              <w:spacing w:after="60"/>
+              <w:rPr>
+                <w:b/>
+              </w:rPr>
+            </w:pPr>
+            <w:r>
+              <w:rPr>
+                <w:b/>
+                <w:bCs/>
+              </w:rPr>
+              <w:t>Connect a plant characteristic to a learning question to explore it further.</w:t>
+            </w:r>
+          </w:p>
+        </w:tc>
+      </w:tr>
+      <w:tr>
+        <w:trPr>
+          <w:tblCellSpacing w:w="15" w:type="dxa"/>
+        </w:trPr>
+        <w:tc>
+          <w:tcPr>
+            <w:tcW w:w="0" w:type="auto"/>
+            <w:vAlign w:val="center"/>
+            <w:hideMark/>
+          </w:tcPr>
+          <w:p>
+            <w:pPr>
+              <w:spacing w:after="60"/>
+              <w:rPr>
+                <w:b/>
+              </w:rPr>
+            </w:pPr>
+            <w:r>
+              <w:rPr>
+                <w:b/>
+              </w:rPr>
+              <w:t>LEARNING 1.10</w:t>
+            </w:r>
+          </w:p>
+        </w:tc>
+        <w:tc>
+          <w:tcPr>
+            <w:tcW w:w="0" w:type="auto"/>
+            <w:vAlign w:val="center"/>
+            <w:hideMark/>
+          </w:tcPr>
+          <w:p>
+            <w:pPr>
+              <w:spacing w:after="60"/>
+              <w:rPr>
+                <w:b/>
+              </w:rPr>
+            </w:pPr>
+            <w:r>
+              <w:rPr>
+                <w:b/>
+                <w:bCs/>
+              </w:rPr>
+              <w:t>Your connection opens a new question. Follow it further, or try another connection.</w:t>
+            </w:r>
+          </w:p>
+        </w:tc>
+      </w:tr>
+      <w:tr>
+        <w:trPr>
+          <w:tblCellSpacing w:w="15" w:type="dxa"/>
+        </w:trPr>
+        <w:tc>
+          <w:tcPr>
+            <w:tcW w:w="0" w:type="auto"/>
+            <w:vAlign w:val="center"/>
+            <w:hideMark/>
+          </w:tcPr>
+          <w:p>
+            <w:pPr>
+              <w:spacing w:after="60"/>
+              <w:rPr>
+                <w:b/>
+              </w:rPr>
+            </w:pPr>
+            <w:r>
+              <w:rPr>
+                <w:b/>
+              </w:rPr>
+              <w:t>LEARNING 1.12</w:t>
+            </w:r>
+          </w:p>
+        </w:tc>
+        <w:tc>
+          <w:tcPr>
+            <w:tcW w:w="0" w:type="auto"/>
+            <w:vAlign w:val="center"/>
+            <w:hideMark/>
+          </w:tcPr>
+          <w:p>
+            <w:pPr>
+              <w:spacing w:after="60"/>
+              <w:rPr>
+                <w:b/>
+              </w:rPr>
+            </w:pPr>
+            <w:r>
+              <w:rPr>
+                <w:b/>
+                <w:bCs/>
+              </w:rPr>
+              <w:t>Take this question back to the landscape. What could you observe here to investigate it?</w:t>
+            </w:r>
+          </w:p>
+        </w:tc>
+      </w:tr>
+      <w:tr>
+        <w:trPr>
+          <w:tblCellSpacing w:w="15" w:type="dxa"/>
+        </w:trPr>
+        <w:tc>
+          <w:tcPr>
+            <w:tcW w:w="0" w:type="auto"/>
+            <w:vAlign w:val="center"/>
+            <w:hideMark/>
+          </w:tcPr>
+          <w:p>
+            <w:pPr>
+              <w:spacing w:after="60"/>
+              <w:rPr>
+                <w:b/>
+              </w:rPr>
+            </w:pPr>
+            <w:r>
+              <w:rPr>
+                <w:b/>
+              </w:rPr>
+              <w:t>CLOSURE 1.1</w:t>
+            </w:r>
+          </w:p>
+        </w:tc>
+        <w:tc>
+          <w:tcPr>
+            <w:tcW w:w="0" w:type="auto"/>
+            <w:vAlign w:val="center"/>
+            <w:hideMark/>
+          </w:tcPr>
+          <w:p>
+            <w:pPr>
+              <w:spacing w:after="60"/>
+              <w:rPr>
+                <w:b/>
+              </w:rPr>
+            </w:pPr>
+            <w:r>
+              <w:rPr>
+                <w:b/>
+                <w:bCs/>
+              </w:rPr>
+              <w:t>Thank you for exploring NourishlandXR. You’ve connected two plants, an observation and two Areas — the beginnings of a living map that can grow with the place.</w:t>
+            </w:r>
+          </w:p>
+        </w:tc>
+      </w:tr>
+    </w:tbl>
     <w:p>
       <w:pPr>
         <w:spacing w:after="60"/>
-      </w:pPr>
-      <w:r>
-        <w:rPr>
-          <w:b/>
-          <w:sz w:val="21"/>
-        </w:rPr>
-        <w:t xml:space="preserve">INTRO 1.2  </w:t>
-      </w:r>
-      <w:r>
-        <w:rPr>
-          <w:sz w:val="21"/>
-        </w:rPr>
-        <w:t>Extended reality, rooted in place — digital plant stories and place-based knowledge appear within the real landscape.</w:t>
-      </w:r>
-    </w:p>
-    <w:p>
-      <w:pPr>
-        <w:pStyle w:val="Heading2"/>
-        <w:spacing w:after="60"/>
-      </w:pPr>
-      <w:r>
-        <w:rPr>
-          <w:sz w:val="21"/>
-        </w:rPr>
-        <w:t>Space and the project</w:t>
-      </w:r>
-    </w:p>
-    <w:p>
-      <w:pPr>
-        <w:spacing w:after="60"/>
-      </w:pPr>
-      <w:r>
-        <w:rPr>
-          <w:b/>
-          <w:sz w:val="21"/>
-        </w:rPr>
-        <w:t xml:space="preserve">SPACE 1.1  </w:t>
-      </w:r>
-      <w:r>
-        <w:rPr>
-          <w:sz w:val="21"/>
-        </w:rPr>
-        <w:t>Meet your Control panel. It gives short actions and contextual help beside the main screen.</w:t>
-      </w:r>
-    </w:p>
-    <w:p>
-      <w:pPr>
-        <w:spacing w:after="60"/>
-      </w:pPr>
-      <w:r>
-        <w:rPr>
-          <w:b/>
-          <w:sz w:val="21"/>
-        </w:rPr>
-        <w:t xml:space="preserve">SPACE 1.2  </w:t>
-      </w:r>
-      <w:r>
-        <w:rPr>
-          <w:sz w:val="21"/>
-        </w:rPr>
-        <w:t>Imagine arriving in a garden and noticing a plant you do not recognise.</w:t>
-      </w:r>
-    </w:p>
-    <w:p>
-      <w:pPr>
-        <w:spacing w:after="60"/>
-      </w:pPr>
-      <w:r>
-        <w:rPr>
-          <w:b/>
-          <w:sz w:val="21"/>
-        </w:rPr>
-        <w:t xml:space="preserve">SPACE 1.3  </w:t>
-      </w:r>
-      <w:r>
-        <w:rPr>
-          <w:sz w:val="21"/>
-        </w:rPr>
-        <w:t>A Project holds information anchored to a real place: Areas, plants, observations and guidance.</w:t>
-      </w:r>
-    </w:p>
-    <w:p>
-      <w:pPr>
-        <w:spacing w:after="60"/>
-      </w:pPr>
-      <w:r>
-        <w:rPr>
-          <w:b/>
-          <w:sz w:val="21"/>
-        </w:rPr>
-        <w:t xml:space="preserve">SPACE 1.4  </w:t>
-      </w:r>
-      <w:r>
-        <w:rPr>
-          <w:sz w:val="21"/>
-        </w:rPr>
-        <w:t>Two plant profiles and a local observation now belong to a place organised into Areas.</w:t>
-      </w:r>
-    </w:p>
-    <w:p>
-      <w:pPr>
-        <w:spacing w:after="60"/>
-      </w:pPr>
-      <w:r>
-        <w:rPr>
-          <w:b/>
-          <w:sz w:val="21"/>
-        </w:rPr>
-        <w:t xml:space="preserve">SPACE 1.5  </w:t>
-      </w:r>
-      <w:r>
-        <w:rPr>
-          <w:sz w:val="21"/>
-        </w:rPr>
-        <w:t>One place can serve visitors, schools and land stewards for different purposes.</w:t>
-      </w:r>
-    </w:p>
-    <w:p>
-      <w:pPr>
-        <w:pStyle w:val="Heading2"/>
-        <w:spacing w:after="60"/>
-      </w:pPr>
-      <w:r>
-        <w:rPr>
-          <w:sz w:val="21"/>
-        </w:rPr>
-        <w:t>Elements and placement</w:t>
-      </w:r>
-    </w:p>
-    <w:p>
-      <w:pPr>
-        <w:spacing w:after="60"/>
-      </w:pPr>
-      <w:r>
-        <w:rPr>
-          <w:b/>
-          <w:sz w:val="21"/>
-        </w:rPr>
-        <w:t xml:space="preserve">ELEMENTS 1.1  </w:t>
-      </w:r>
-      <w:r>
-        <w:rPr>
-          <w:sz w:val="21"/>
-        </w:rPr>
-        <w:t>Every plant holds information: identity, ecology, care, uses, local knowledge and sources.</w:t>
-      </w:r>
-    </w:p>
-    <w:p>
-      <w:pPr>
-        <w:spacing w:after="60"/>
-      </w:pPr>
-      <w:r>
-        <w:rPr>
-          <w:b/>
-          <w:sz w:val="21"/>
-        </w:rPr>
-        <w:t xml:space="preserve">ELEMENTS 1.2  </w:t>
-      </w:r>
-      <w:r>
-        <w:rPr>
-          <w:sz w:val="21"/>
-        </w:rPr>
-        <w:t>Areas organise a place; directional Totem signs point to Plant Orbs, Notes and other Totems.</w:t>
-      </w:r>
-    </w:p>
-    <w:p>
-      <w:pPr>
-        <w:spacing w:after="60"/>
-      </w:pPr>
-      <w:r>
-        <w:rPr>
-          <w:b/>
-          <w:sz w:val="21"/>
-        </w:rPr>
-        <w:t xml:space="preserve">ELEMENTS 1.3  </w:t>
-      </w:r>
-      <w:r>
-        <w:rPr>
-          <w:sz w:val="21"/>
-        </w:rPr>
-        <w:t>Begin with Pigeon Pea. Aim at the plant or the place where its tag belongs.</w:t>
-      </w:r>
-    </w:p>
-    <w:p>
-      <w:pPr>
-        <w:spacing w:after="60"/>
-      </w:pPr>
-      <w:r>
-        <w:rPr>
-          <w:b/>
-          <w:sz w:val="21"/>
-        </w:rPr>
-        <w:t xml:space="preserve">ELEMENTS 1.4  </w:t>
-      </w:r>
-      <w:r>
-        <w:rPr>
-          <w:sz w:val="21"/>
-        </w:rPr>
-        <w:t>A plant story in this place — prepare the Pigeon Pea placement.</w:t>
-      </w:r>
-    </w:p>
-    <w:p>
-      <w:pPr>
-        <w:spacing w:after="60"/>
-      </w:pPr>
-      <w:r>
-        <w:rPr>
-          <w:b/>
-          <w:sz w:val="21"/>
-        </w:rPr>
-        <w:t xml:space="preserve">ELEMENTS 1.5  </w:t>
-      </w:r>
-      <w:r>
-        <w:rPr>
-          <w:sz w:val="21"/>
-        </w:rPr>
-        <w:t>Place Pigeon Pea. Adjust distance, then confirm the tag location.</w:t>
-      </w:r>
-    </w:p>
-    <w:p>
-      <w:pPr>
-        <w:spacing w:after="60"/>
-      </w:pPr>
-      <w:r>
-        <w:rPr>
-          <w:b/>
-          <w:sz w:val="21"/>
-        </w:rPr>
-        <w:t xml:space="preserve">ELEMENTS 1.6  </w:t>
-      </w:r>
-      <w:r>
-        <w:rPr>
-          <w:sz w:val="21"/>
-        </w:rPr>
-        <w:t>This is the Plant Orb. Select it to open information; hold it to move it.</w:t>
-      </w:r>
-    </w:p>
-    <w:p>
-      <w:pPr>
-        <w:spacing w:after="60"/>
-      </w:pPr>
-      <w:r>
-        <w:rPr>
-          <w:b/>
-          <w:sz w:val="21"/>
-        </w:rPr>
-        <w:t xml:space="preserve">ELEMENTS 1.7  </w:t>
-      </w:r>
-      <w:r>
-        <w:rPr>
-          <w:sz w:val="21"/>
-        </w:rPr>
-        <w:t>Explore Pigeon Pea through connected information cells.</w:t>
-      </w:r>
-    </w:p>
-    <w:p>
-      <w:pPr>
-        <w:spacing w:after="60"/>
-      </w:pPr>
-      <w:r>
-        <w:rPr>
-          <w:b/>
-          <w:sz w:val="21"/>
-        </w:rPr>
-        <w:t xml:space="preserve">ELEMENTS 1.8  </w:t>
-      </w:r>
-      <w:r>
-        <w:rPr>
-          <w:sz w:val="21"/>
-        </w:rPr>
-        <w:t>Virtual tag / Web Mode: the plant can also be opened in a flat browser view.</w:t>
-      </w:r>
-    </w:p>
-    <w:p>
-      <w:pPr>
-        <w:spacing w:after="60"/>
-      </w:pPr>
-      <w:r>
-        <w:rPr>
-          <w:b/>
-          <w:sz w:val="21"/>
-        </w:rPr>
-        <w:t xml:space="preserve">ELEMENTS 1.9  </w:t>
-      </w:r>
-      <w:r>
-        <w:rPr>
-          <w:sz w:val="21"/>
-        </w:rPr>
-        <w:t>Apply thinking in this place: turn plant information into a practical question.</w:t>
-      </w:r>
-    </w:p>
-    <w:p>
-      <w:pPr>
-        <w:spacing w:after="60"/>
-      </w:pPr>
-      <w:r>
-        <w:rPr>
-          <w:b/>
-          <w:sz w:val="21"/>
-        </w:rPr>
-        <w:t xml:space="preserve">ELEMENTS 1.10  </w:t>
-      </w:r>
-      <w:r>
-        <w:rPr>
-          <w:sz w:val="21"/>
-        </w:rPr>
-        <w:t>Compare a second plant — introduce Moringa.</w:t>
-      </w:r>
-    </w:p>
-    <w:p>
-      <w:pPr>
-        <w:spacing w:after="60"/>
-      </w:pPr>
-      <w:r>
-        <w:rPr>
-          <w:b/>
-          <w:sz w:val="21"/>
-        </w:rPr>
-        <w:t xml:space="preserve">ELEMENTS 1.11  </w:t>
-      </w:r>
-      <w:r>
-        <w:rPr>
-          <w:sz w:val="21"/>
-        </w:rPr>
-        <w:t>Place Moringa as a separate, movable Plant Orb.</w:t>
-      </w:r>
-    </w:p>
-    <w:p>
-      <w:pPr>
-        <w:spacing w:after="60"/>
-      </w:pPr>
-      <w:r>
-        <w:rPr>
-          <w:b/>
-          <w:sz w:val="21"/>
-        </w:rPr>
-        <w:t xml:space="preserve">ELEMENTS 1.12  </w:t>
-      </w:r>
-      <w:r>
-        <w:rPr>
-          <w:sz w:val="21"/>
-        </w:rPr>
-        <w:t>The living map can compare two plant profiles.</w:t>
-      </w:r>
-    </w:p>
-    <w:p>
-      <w:pPr>
-        <w:spacing w:after="60"/>
-      </w:pPr>
-      <w:r>
-        <w:rPr>
-          <w:b/>
-          <w:sz w:val="21"/>
-        </w:rPr>
-        <w:t xml:space="preserve">ELEMENTS 1.13  </w:t>
-      </w:r>
-      <w:r>
-        <w:rPr>
-          <w:sz w:val="21"/>
-        </w:rPr>
-        <w:t>Explore Moringa through its own information cells.</w:t>
-      </w:r>
-    </w:p>
-    <w:p>
-      <w:pPr>
-        <w:spacing w:after="60"/>
-      </w:pPr>
-      <w:r>
-        <w:rPr>
-          <w:b/>
-          <w:sz w:val="21"/>
-        </w:rPr>
-        <w:t xml:space="preserve">ELEMENTS 1.14  </w:t>
-      </w:r>
-      <w:r>
-        <w:rPr>
-          <w:sz w:val="21"/>
-        </w:rPr>
-        <w:t>Turn attention into a local record.</w:t>
-      </w:r>
-    </w:p>
-    <w:p>
-      <w:pPr>
-        <w:spacing w:after="60"/>
-      </w:pPr>
-      <w:r>
-        <w:rPr>
-          <w:b/>
-          <w:sz w:val="21"/>
-        </w:rPr>
-        <w:t xml:space="preserve">ELEMENTS 1.15  </w:t>
-      </w:r>
-      <w:r>
-        <w:rPr>
-          <w:sz w:val="21"/>
-        </w:rPr>
-        <w:t>Add one observation using a Note.</w:t>
-      </w:r>
-    </w:p>
-    <w:p>
-      <w:pPr>
-        <w:spacing w:after="60"/>
-      </w:pPr>
-      <w:r>
-        <w:rPr>
-          <w:b/>
-          <w:sz w:val="21"/>
-        </w:rPr>
-        <w:t xml:space="preserve">ELEMENTS 1.16  </w:t>
-      </w:r>
-      <w:r>
-        <w:rPr>
-          <w:sz w:val="21"/>
-        </w:rPr>
-        <w:t>Place the Note beside what it describes.</w:t>
-      </w:r>
-    </w:p>
-    <w:p>
-      <w:pPr>
-        <w:spacing w:after="60"/>
-      </w:pPr>
-      <w:r>
-        <w:rPr>
-          <w:b/>
-          <w:sz w:val="21"/>
-        </w:rPr>
-        <w:t xml:space="preserve">ELEMENTS 1.17  </w:t>
-      </w:r>
-      <w:r>
-        <w:rPr>
-          <w:sz w:val="21"/>
-        </w:rPr>
-        <w:t>The Note is in place and can hold a change, image, memory or task.</w:t>
-      </w:r>
-    </w:p>
-    <w:p>
-      <w:pPr>
-        <w:spacing w:after="60"/>
-      </w:pPr>
-      <w:r>
-        <w:rPr>
-          <w:b/>
-          <w:sz w:val="21"/>
-        </w:rPr>
-        <w:t xml:space="preserve">ELEMENTS 1.18  </w:t>
-      </w:r>
-      <w:r>
-        <w:rPr>
-          <w:sz w:val="21"/>
-        </w:rPr>
-        <w:t>Meet the Totem: welcome to an Area, directional signs, Show Signs and Fade.</w:t>
-      </w:r>
-    </w:p>
-    <w:p>
-      <w:pPr>
-        <w:spacing w:after="60"/>
-      </w:pPr>
-      <w:r>
-        <w:rPr>
-          <w:b/>
-          <w:sz w:val="21"/>
-        </w:rPr>
-        <w:t xml:space="preserve">ELEMENTS 1.19  </w:t>
-      </w:r>
-      <w:r>
-        <w:rPr>
-          <w:sz w:val="21"/>
-        </w:rPr>
-        <w:t>Area 1 is ready. Choose a sign to find a nearby plant or Note.</w:t>
-      </w:r>
-    </w:p>
-    <w:p>
-      <w:pPr>
-        <w:spacing w:after="60"/>
-      </w:pPr>
-      <w:r>
-        <w:rPr>
-          <w:b/>
-          <w:sz w:val="21"/>
-        </w:rPr>
-        <w:t xml:space="preserve">ELEMENTS 1.20  </w:t>
-      </w:r>
-      <w:r>
-        <w:rPr>
-          <w:sz w:val="21"/>
-        </w:rPr>
-        <w:t>Meet Area 2. Totem 2 is a sample layout with its own Plant Orbs and Note.</w:t>
-      </w:r>
-    </w:p>
-    <w:p>
-      <w:pPr>
-        <w:spacing w:after="60"/>
-      </w:pPr>
-      <w:r>
-        <w:rPr>
-          <w:b/>
-          <w:sz w:val="21"/>
-        </w:rPr>
-        <w:t xml:space="preserve">ELEMENTS 1.21  </w:t>
-      </w:r>
-      <w:r>
-        <w:rPr>
-          <w:sz w:val="21"/>
-        </w:rPr>
-        <w:t>The Areas are linked by a route while keeping local information separate.</w:t>
-      </w:r>
-    </w:p>
-    <w:p>
-      <w:pPr>
-        <w:spacing w:after="60"/>
-      </w:pPr>
-      <w:r>
-        <w:rPr>
-          <w:b/>
-          <w:sz w:val="21"/>
-        </w:rPr>
-        <w:t xml:space="preserve">ELEMENTS 1.22  </w:t>
-      </w:r>
-      <w:r>
-        <w:rPr>
-          <w:sz w:val="21"/>
-        </w:rPr>
-        <w:t>Why link Areas: guide visitors between places and connected knowledge.</w:t>
-      </w:r>
-    </w:p>
-    <w:p>
-      <w:pPr>
-        <w:spacing w:after="60"/>
-      </w:pPr>
-      <w:r>
-        <w:rPr>
-          <w:b/>
-          <w:sz w:val="21"/>
-        </w:rPr>
-        <w:t xml:space="preserve">ELEMENTS 1.23–1.24  </w:t>
-      </w:r>
-      <w:r>
-        <w:rPr>
-          <w:sz w:val="21"/>
-        </w:rPr>
-        <w:t>Optional Totem placement prompt and confirmation.</w:t>
-      </w:r>
-    </w:p>
-    <w:p>
-      <w:pPr>
-        <w:pStyle w:val="Heading2"/>
-        <w:spacing w:after="60"/>
-      </w:pPr>
-      <w:r>
-        <w:rPr>
-          <w:sz w:val="21"/>
-        </w:rPr>
-        <w:t>Learning and connection</w:t>
-      </w:r>
-    </w:p>
-    <w:p>
-      <w:pPr>
-        <w:spacing w:after="60"/>
-      </w:pPr>
-      <w:r>
-        <w:rPr>
-          <w:b/>
-          <w:sz w:val="21"/>
-        </w:rPr>
-        <w:t xml:space="preserve">LEARNING 1.1  </w:t>
-      </w:r>
-      <w:r>
-        <w:rPr>
-          <w:sz w:val="21"/>
-        </w:rPr>
-        <w:t>Connect a Pigeon Pea characteristic to a learning question.</w:t>
-      </w:r>
-    </w:p>
-    <w:p>
-      <w:pPr>
-        <w:spacing w:after="60"/>
-      </w:pPr>
-      <w:r>
-        <w:rPr>
-          <w:b/>
-          <w:sz w:val="21"/>
-        </w:rPr>
-        <w:t xml:space="preserve">LEARNING 1.2  </w:t>
-      </w:r>
-      <w:r>
-        <w:rPr>
-          <w:sz w:val="21"/>
-        </w:rPr>
-        <w:t>Read what is here: check plant information against the actual place.</w:t>
-      </w:r>
-    </w:p>
-    <w:p>
-      <w:pPr>
-        <w:spacing w:after="60"/>
-      </w:pPr>
-      <w:r>
-        <w:rPr>
-          <w:b/>
-          <w:sz w:val="21"/>
-        </w:rPr>
-        <w:t xml:space="preserve">LEARNING 1.3  </w:t>
-      </w:r>
-      <w:r>
-        <w:rPr>
-          <w:sz w:val="21"/>
-        </w:rPr>
-        <w:t>Understand how it works: growth, dependencies, support and uncertainty.</w:t>
-      </w:r>
-    </w:p>
-    <w:p>
-      <w:pPr>
-        <w:spacing w:after="60"/>
-      </w:pPr>
-      <w:r>
-        <w:rPr>
-          <w:b/>
-          <w:sz w:val="21"/>
-        </w:rPr>
-        <w:t xml:space="preserve">LEARNING 1.4  </w:t>
-      </w:r>
-      <w:r>
-        <w:rPr>
-          <w:sz w:val="21"/>
-        </w:rPr>
-        <w:t>Connect information to purpose: what could this knowledge help someone do?</w:t>
-      </w:r>
-    </w:p>
-    <w:p>
-      <w:pPr>
-        <w:spacing w:after="60"/>
-      </w:pPr>
-      <w:r>
-        <w:rPr>
-          <w:b/>
-          <w:sz w:val="21"/>
-        </w:rPr>
-        <w:t xml:space="preserve">LEARNING 1.5  </w:t>
-      </w:r>
-      <w:r>
-        <w:rPr>
-          <w:sz w:val="21"/>
-        </w:rPr>
-        <w:t>Choose, observe and learn: make a small decision, record what happens and adjust.</w:t>
-      </w:r>
-    </w:p>
-    <w:p>
-      <w:pPr>
-        <w:spacing w:after="60"/>
-      </w:pPr>
-      <w:r>
-        <w:rPr>
-          <w:b/>
-          <w:sz w:val="21"/>
-        </w:rPr>
-        <w:t xml:space="preserve">LEARNING 1.6  </w:t>
-      </w:r>
-      <w:r>
-        <w:rPr>
-          <w:sz w:val="21"/>
-        </w:rPr>
-        <w:t>Learning can happen in the landscape or as a standalone pathway.</w:t>
-      </w:r>
-    </w:p>
-    <w:p>
-      <w:pPr>
-        <w:spacing w:after="60"/>
-      </w:pPr>
-      <w:r>
-        <w:rPr>
-          <w:b/>
-          <w:sz w:val="21"/>
-        </w:rPr>
-        <w:t xml:space="preserve">LEARNING 1.7  </w:t>
-      </w:r>
-      <w:r>
-        <w:rPr>
-          <w:sz w:val="21"/>
-        </w:rPr>
-        <w:t>Choose a pathway archetype and explore its connected learning cells.</w:t>
-      </w:r>
-    </w:p>
-    <w:p>
-      <w:pPr>
-        <w:spacing w:after="60"/>
-      </w:pPr>
-      <w:r>
-        <w:rPr>
-          <w:b/>
-          <w:sz w:val="21"/>
-        </w:rPr>
-        <w:t xml:space="preserve">LEARNING 1.8  </w:t>
-      </w:r>
-      <w:r>
-        <w:rPr>
-          <w:sz w:val="21"/>
-        </w:rPr>
-        <w:t>Knowledge grows through connection: choose a plant characteristic and a learning cell.</w:t>
-      </w:r>
-    </w:p>
-    <w:p>
-      <w:pPr>
-        <w:spacing w:after="60"/>
-      </w:pPr>
-      <w:r>
-        <w:rPr>
-          <w:b/>
-          <w:sz w:val="21"/>
-        </w:rPr>
-        <w:t xml:space="preserve">LEARNING 1.9  </w:t>
-      </w:r>
-      <w:r>
-        <w:rPr>
-          <w:sz w:val="21"/>
-        </w:rPr>
-        <w:t>Choose Pruning or Nitrogen Fixation; hold and drag its glowing node to the matching cell.</w:t>
-      </w:r>
-    </w:p>
-    <w:p>
-      <w:pPr>
-        <w:spacing w:after="60"/>
-      </w:pPr>
-      <w:r>
-        <w:rPr>
-          <w:b/>
-          <w:sz w:val="21"/>
-        </w:rPr>
-        <w:t xml:space="preserve">LEARNING 1.10  </w:t>
-      </w:r>
-      <w:r>
-        <w:rPr>
-          <w:sz w:val="21"/>
-        </w:rPr>
-        <w:t>The first connection reveals a new idea. Continue or explore more deeply.</w:t>
-      </w:r>
-    </w:p>
-    <w:p>
-      <w:pPr>
-        <w:spacing w:after="60"/>
-      </w:pPr>
-      <w:r>
-        <w:rPr>
-          <w:b/>
-          <w:sz w:val="21"/>
-        </w:rPr>
-        <w:t xml:space="preserve">LEARNING 1.11  </w:t>
-      </w:r>
-      <w:r>
-        <w:rPr>
-          <w:sz w:val="21"/>
-        </w:rPr>
-        <w:t>Connect the new idea to Place and Observation.</w:t>
-      </w:r>
-    </w:p>
-    <w:p>
-      <w:pPr>
-        <w:spacing w:after="60"/>
-      </w:pPr>
-      <w:r>
-        <w:rPr>
-          <w:b/>
-          <w:sz w:val="21"/>
-        </w:rPr>
-        <w:t xml:space="preserve">LEARNING 1.12  </w:t>
-      </w:r>
-      <w:r>
-        <w:rPr>
-          <w:sz w:val="21"/>
-        </w:rPr>
-        <w:t>A deeper question is ready to carry back into the living place.</w:t>
-      </w:r>
-    </w:p>
-    <w:p>
-      <w:pPr>
-        <w:spacing w:after="60"/>
-      </w:pPr>
-      <w:r>
-        <w:rPr>
-          <w:b/>
-          <w:sz w:val="21"/>
-        </w:rPr>
-        <w:t xml:space="preserve">LEARNING 2.1–2.3  </w:t>
-      </w:r>
-      <w:r>
-        <w:rPr>
-          <w:sz w:val="21"/>
-        </w:rPr>
-        <w:t>Optional short modules: create a food forest or identify a native forest.</w:t>
-      </w:r>
-    </w:p>
-    <w:p>
-      <w:pPr>
-        <w:pStyle w:val="Heading2"/>
-        <w:spacing w:after="60"/>
-      </w:pPr>
-      <w:r>
-        <w:rPr>
-          <w:sz w:val="21"/>
-        </w:rPr>
-        <w:t>Closure</w:t>
-      </w:r>
-    </w:p>
-    <w:p>
-      <w:pPr>
-        <w:spacing w:after="60"/>
-      </w:pPr>
-      <w:r>
-        <w:rPr>
-          <w:b/>
-          <w:sz w:val="21"/>
-        </w:rPr>
-        <w:t xml:space="preserve">CLOSURE 1.1  </w:t>
-      </w:r>
-      <w:r>
-        <w:rPr>
-          <w:sz w:val="21"/>
-        </w:rPr>
-        <w:t>Thank you: two plants, one observation, linked Areas and connected learning form a living information map.</w:t>
-      </w:r>
-    </w:p>
-    <w:p>
-      <w:pPr>
-        <w:spacing w:before="360" w:after="160"/>
       </w:pPr>
       <w:r>
         <w:rPr>
@@ -1319,15 +1981,7 @@
         <w:t xml:space="preserve"> </w:t>
       </w:r>
       <w:r>
-        <w:t xml:space="preserve">Welcome to </w:t>
-      </w:r>
-      <w:proofErr w:type="spellStart"/>
-      <w:r>
-        <w:t>NourishlandXR</w:t>
-      </w:r>
-      <w:proofErr w:type="spellEnd"/>
-      <w:r>
-        <w:t xml:space="preserve">, a </w:t>
+        <w:t xml:space="preserve">Welcome to NourishlandXR, a </w:t>
       </w:r>
       <w:r>
         <w:t>S</w:t>

</xml_diff>

<commit_message>
V0.9292 Keep Settings and images independent and expand demo Quick Edits
</commit_message>
<xml_diff>
--- a/data1/demo.docx
+++ b/data1/demo.docx
@@ -64,7 +64,7 @@
           </w:tcPr>
           <w:p>
             <w:r>
-              <w:t>0.9230</w:t>
+              <w:t>0.9292</w:t>
             </w:r>
           </w:p>
         </w:tc>
@@ -104,7 +104,7 @@
           </w:tcPr>
           <w:p>
             <w:r>
-              <w:t>30 September 2026</w:t>
+              <w:t>4 October 2026</w:t>
             </w:r>
           </w:p>
         </w:tc>
@@ -167,7 +167,7 @@
         <w:spacing w:after="60"/>
       </w:pPr>
       <w:r>
-        <w:t>Working slide map for version 0.9230. Edit the wording here first; the Decision and detailed narrative below remain as previously written.</w:t>
+        <w:t>Working review copy for version 0.9292. Every section below includes Main screen, Control panel info and HINTS. Edit these blocks to review each surface without opening the project. Descriptions of hidden or selection-dependent content explain the current behaviour; braces identify text filled from the selected cells. The detailed narrative below is retained as an earlier reference. Word edits are applied to the application in a separate update.</w:t>
       </w:r>
     </w:p>
     <w:p>
@@ -263,19 +263,8 @@
             <w:hideMark/>
           </w:tcPr>
           <w:p>
-            <w:pPr>
-              <w:spacing w:after="60"/>
-              <w:rPr>
-                <w:b/>
-                <w:bCs/>
-              </w:rPr>
-            </w:pPr>
-            <w:r>
-              <w:rPr>
-                <w:b/>
-                <w:bCs/>
-              </w:rPr>
-              <w:t>Suggested wording</w:t>
+            <w:r>
+              <w:t>Main screen, Control panel info and HINTS</w:t>
             </w:r>
           </w:p>
         </w:tc>
@@ -283,11 +272,12 @@
       <w:tr>
         <w:trPr>
           <w:tblCellSpacing w:w="15" w:type="dxa"/>
+          <w:cantSplit/>
         </w:trPr>
         <w:tc>
           <w:tcPr>
             <w:tcW w:w="0" w:type="auto"/>
-            <w:vAlign w:val="center"/>
+            <w:vAlign w:val="top"/>
             <w:hideMark/>
           </w:tcPr>
           <w:p>
@@ -300,6 +290,8 @@
             <w:r>
               <w:rPr>
                 <w:b/>
+                <w:color w:val="000000"/>
+                <w:sz w:val="20"/>
               </w:rPr>
               <w:t>INTRO 1.1</w:t>
             </w:r>
@@ -308,36 +300,78 @@
         <w:tc>
           <w:tcPr>
             <w:tcW w:w="0" w:type="auto"/>
-            <w:vAlign w:val="center"/>
+            <w:vAlign w:val="top"/>
             <w:hideMark/>
           </w:tcPr>
           <w:p>
             <w:pPr>
+              <w:keepLines/>
+              <w:spacing w:after="140"/>
+            </w:pPr>
+            <w:r>
+              <w:rPr>
+                <w:color w:val="000000"/>
+              </w:rPr>
+            </w:r>
+            <w:r>
+              <w:rPr>
+                <w:b/>
+                <w:color w:val="000000"/>
+                <w:sz w:val="21"/>
+              </w:rPr>
+              <w:t>Main screen</w:t>
+              <w:br/>
+            </w:r>
+            <w:r>
+              <w:rPr>
+                <w:color w:val="000000"/>
+                <w:sz w:val="21"/>
+              </w:rPr>
+              <w:t>Welcome to NourishlandXR — where extended reality brings plant stories and knowledge into living landscapes.</w:t>
+            </w:r>
+          </w:p>
+          <w:p>
+            <w:pPr>
+              <w:keepLines/>
+              <w:spacing w:after="140"/>
+            </w:pPr>
+            <w:r>
+              <w:rPr>
+                <w:b/>
+                <w:color w:val="000000"/>
+                <w:sz w:val="21"/>
+              </w:rPr>
+              <w:t>Control panel info</w:t>
+              <w:br/>
+            </w:r>
+            <w:r>
+              <w:rPr>
+                <w:color w:val="000000"/>
+                <w:sz w:val="21"/>
+              </w:rPr>
+              <w:t>Hidden during the opening welcome.</w:t>
+            </w:r>
+          </w:p>
+          <w:p>
+            <w:pPr>
+              <w:keepLines/>
               <w:spacing w:after="60"/>
+            </w:pPr>
+            <w:r>
               <w:rPr>
                 <w:b/>
-              </w:rPr>
-            </w:pPr>
-            <w:r>
-              <w:rPr>
-                <w:b/>
-                <w:bCs/>
-              </w:rPr>
-              <w:t xml:space="preserve">Welcome to NourishlandXR — where extended reality brings plant stories </w:t>
-            </w:r>
-            <w:r>
-              <w:rPr>
-                <w:b/>
-                <w:bCs/>
-              </w:rPr>
-              <w:t xml:space="preserve">and knowledge </w:t>
-            </w:r>
-            <w:r>
-              <w:rPr>
-                <w:b/>
-                <w:bCs/>
-              </w:rPr>
-              <w:t>into living landscapes.</w:t>
+                <w:color w:val="000000"/>
+                <w:sz w:val="21"/>
+              </w:rPr>
+              <w:t>HINTS</w:t>
+              <w:br/>
+            </w:r>
+            <w:r>
+              <w:rPr>
+                <w:color w:val="000000"/>
+                <w:sz w:val="21"/>
+              </w:rPr>
+              <w:t>Continue when you are ready.</w:t>
             </w:r>
           </w:p>
         </w:tc>
@@ -345,11 +379,12 @@
       <w:tr>
         <w:trPr>
           <w:tblCellSpacing w:w="15" w:type="dxa"/>
+          <w:cantSplit/>
         </w:trPr>
         <w:tc>
           <w:tcPr>
             <w:tcW w:w="0" w:type="auto"/>
-            <w:vAlign w:val="center"/>
+            <w:vAlign w:val="top"/>
             <w:hideMark/>
           </w:tcPr>
           <w:p>
@@ -362,6 +397,8 @@
             <w:r>
               <w:rPr>
                 <w:b/>
+                <w:color w:val="000000"/>
+                <w:sz w:val="20"/>
               </w:rPr>
               <w:t>INTRO 1.2</w:t>
             </w:r>
@@ -370,22 +407,78 @@
         <w:tc>
           <w:tcPr>
             <w:tcW w:w="0" w:type="auto"/>
-            <w:vAlign w:val="center"/>
+            <w:vAlign w:val="top"/>
             <w:hideMark/>
           </w:tcPr>
           <w:p>
             <w:pPr>
+              <w:keepLines/>
+              <w:spacing w:after="140"/>
+            </w:pPr>
+            <w:r>
+              <w:rPr>
+                <w:color w:val="000000"/>
+              </w:rPr>
+            </w:r>
+            <w:r>
+              <w:rPr>
+                <w:b/>
+                <w:color w:val="000000"/>
+                <w:sz w:val="21"/>
+              </w:rPr>
+              <w:t>Main screen</w:t>
+              <w:br/>
+            </w:r>
+            <w:r>
+              <w:rPr>
+                <w:color w:val="000000"/>
+                <w:sz w:val="21"/>
+              </w:rPr>
+              <w:t>Extended reality connects digital information with the world around you. Here, plants and places become starting points for discovery and learning.</w:t>
+            </w:r>
+          </w:p>
+          <w:p>
+            <w:pPr>
+              <w:keepLines/>
+              <w:spacing w:after="140"/>
+            </w:pPr>
+            <w:r>
+              <w:rPr>
+                <w:b/>
+                <w:color w:val="000000"/>
+                <w:sz w:val="21"/>
+              </w:rPr>
+              <w:t>Control panel info</w:t>
+              <w:br/>
+            </w:r>
+            <w:r>
+              <w:rPr>
+                <w:color w:val="000000"/>
+                <w:sz w:val="21"/>
+              </w:rPr>
+              <w:t>Hidden during the opening explanation.</w:t>
+            </w:r>
+          </w:p>
+          <w:p>
+            <w:pPr>
+              <w:keepLines/>
               <w:spacing w:after="60"/>
+            </w:pPr>
+            <w:r>
               <w:rPr>
                 <w:b/>
-              </w:rPr>
-            </w:pPr>
-            <w:r>
-              <w:rPr>
-                <w:b/>
-                <w:bCs/>
-              </w:rPr>
-              <w:t>Extended reality connects digital information with the world around you. Here, plants and places become starting points for discovery and learning.</w:t>
+                <w:color w:val="000000"/>
+                <w:sz w:val="21"/>
+              </w:rPr>
+              <w:t>HINTS</w:t>
+              <w:br/>
+            </w:r>
+            <w:r>
+              <w:rPr>
+                <w:color w:val="000000"/>
+                <w:sz w:val="21"/>
+              </w:rPr>
+              <w:t>Continue to meet the Control panel.</w:t>
             </w:r>
           </w:p>
         </w:tc>
@@ -393,11 +486,12 @@
       <w:tr>
         <w:trPr>
           <w:tblCellSpacing w:w="15" w:type="dxa"/>
+          <w:cantSplit/>
         </w:trPr>
         <w:tc>
           <w:tcPr>
             <w:tcW w:w="0" w:type="auto"/>
-            <w:vAlign w:val="center"/>
+            <w:vAlign w:val="top"/>
             <w:hideMark/>
           </w:tcPr>
           <w:p>
@@ -410,6 +504,8 @@
             <w:r>
               <w:rPr>
                 <w:b/>
+                <w:color w:val="000000"/>
+                <w:sz w:val="20"/>
               </w:rPr>
               <w:t>SPACE 1.1</w:t>
             </w:r>
@@ -418,22 +514,78 @@
         <w:tc>
           <w:tcPr>
             <w:tcW w:w="0" w:type="auto"/>
-            <w:vAlign w:val="center"/>
+            <w:vAlign w:val="top"/>
             <w:hideMark/>
           </w:tcPr>
           <w:p>
             <w:pPr>
+              <w:keepLines/>
+              <w:spacing w:after="140"/>
+            </w:pPr>
+            <w:r>
+              <w:rPr>
+                <w:color w:val="000000"/>
+              </w:rPr>
+            </w:r>
+            <w:r>
+              <w:rPr>
+                <w:b/>
+                <w:color w:val="000000"/>
+                <w:sz w:val="21"/>
+              </w:rPr>
+              <w:t>Main screen</w:t>
+              <w:br/>
+            </w:r>
+            <w:r>
+              <w:rPr>
+                <w:color w:val="000000"/>
+                <w:sz w:val="21"/>
+              </w:rPr>
+              <w:t>This is your Control Panel. It shows the actions and help available at each step.</w:t>
+            </w:r>
+          </w:p>
+          <w:p>
+            <w:pPr>
+              <w:keepLines/>
+              <w:spacing w:after="140"/>
+            </w:pPr>
+            <w:r>
+              <w:rPr>
+                <w:b/>
+                <w:color w:val="000000"/>
+                <w:sz w:val="21"/>
+              </w:rPr>
+              <w:t>Control panel info</w:t>
+              <w:br/>
+            </w:r>
+            <w:r>
+              <w:rPr>
+                <w:color w:val="000000"/>
+                <w:sz w:val="21"/>
+              </w:rPr>
+              <w:t>Selected information appears here. Use Settings to adjust the view, Help for guidance, Back to revisit a page, and Hide when you want to focus on the landscape.</w:t>
+            </w:r>
+          </w:p>
+          <w:p>
+            <w:pPr>
+              <w:keepLines/>
               <w:spacing w:after="60"/>
+            </w:pPr>
+            <w:r>
               <w:rPr>
                 <w:b/>
-              </w:rPr>
-            </w:pPr>
-            <w:r>
-              <w:rPr>
-                <w:b/>
-                <w:bCs/>
-              </w:rPr>
-              <w:t>This is your Control Panel. It shows the actions and help available at each step.</w:t>
+                <w:color w:val="000000"/>
+                <w:sz w:val="21"/>
+              </w:rPr>
+              <w:t>HINTS</w:t>
+              <w:br/>
+            </w:r>
+            <w:r>
+              <w:rPr>
+                <w:color w:val="000000"/>
+                <w:sz w:val="21"/>
+              </w:rPr>
+              <w:t>Adjust panel to your liking.</w:t>
             </w:r>
           </w:p>
         </w:tc>
@@ -441,11 +593,12 @@
       <w:tr>
         <w:trPr>
           <w:tblCellSpacing w:w="15" w:type="dxa"/>
+          <w:cantSplit/>
         </w:trPr>
         <w:tc>
           <w:tcPr>
             <w:tcW w:w="0" w:type="auto"/>
-            <w:vAlign w:val="center"/>
+            <w:vAlign w:val="top"/>
             <w:hideMark/>
           </w:tcPr>
           <w:p>
@@ -458,6 +611,8 @@
             <w:r>
               <w:rPr>
                 <w:b/>
+                <w:color w:val="000000"/>
+                <w:sz w:val="20"/>
               </w:rPr>
               <w:t>SPACE 1.2</w:t>
             </w:r>
@@ -466,22 +621,78 @@
         <w:tc>
           <w:tcPr>
             <w:tcW w:w="0" w:type="auto"/>
-            <w:vAlign w:val="center"/>
+            <w:vAlign w:val="top"/>
             <w:hideMark/>
           </w:tcPr>
           <w:p>
             <w:pPr>
+              <w:keepLines/>
+              <w:spacing w:after="140"/>
+            </w:pPr>
+            <w:r>
+              <w:rPr>
+                <w:color w:val="000000"/>
+              </w:rPr>
+            </w:r>
+            <w:r>
+              <w:rPr>
+                <w:b/>
+                <w:color w:val="000000"/>
+                <w:sz w:val="21"/>
+              </w:rPr>
+              <w:t>Main screen</w:t>
+              <w:br/>
+            </w:r>
+            <w:r>
+              <w:rPr>
+                <w:color w:val="000000"/>
+                <w:sz w:val="21"/>
+              </w:rPr>
+              <w:t>You arrive in a garden. A plant catches your attention — what is it, and what role does it play here?</w:t>
+            </w:r>
+          </w:p>
+          <w:p>
+            <w:pPr>
+              <w:keepLines/>
+              <w:spacing w:after="140"/>
+            </w:pPr>
+            <w:r>
+              <w:rPr>
+                <w:b/>
+                <w:color w:val="000000"/>
+                <w:sz w:val="21"/>
+              </w:rPr>
+              <w:t>Control panel info</w:t>
+              <w:br/>
+            </w:r>
+            <w:r>
+              <w:rPr>
+                <w:color w:val="000000"/>
+                <w:sz w:val="21"/>
+              </w:rPr>
+              <w:t>The Control panel remains available. No additional fixed body text is shown; the garden illustration opens independently.</w:t>
+            </w:r>
+          </w:p>
+          <w:p>
+            <w:pPr>
+              <w:keepLines/>
               <w:spacing w:after="60"/>
+            </w:pPr>
+            <w:r>
               <w:rPr>
                 <w:b/>
-              </w:rPr>
-            </w:pPr>
-            <w:r>
-              <w:rPr>
-                <w:b/>
-                <w:bCs/>
-              </w:rPr>
-              <w:t>You arrive in a garden. A plant catches your attention — what is it, and what role does it play here?</w:t>
+                <w:color w:val="000000"/>
+                <w:sz w:val="21"/>
+              </w:rPr>
+              <w:t>HINTS</w:t>
+              <w:br/>
+            </w:r>
+            <w:r>
+              <w:rPr>
+                <w:color w:val="000000"/>
+                <w:sz w:val="21"/>
+              </w:rPr>
+              <w:t>Use Continue below.</w:t>
             </w:r>
           </w:p>
         </w:tc>
@@ -489,11 +700,12 @@
       <w:tr>
         <w:trPr>
           <w:tblCellSpacing w:w="15" w:type="dxa"/>
+          <w:cantSplit/>
         </w:trPr>
         <w:tc>
           <w:tcPr>
             <w:tcW w:w="0" w:type="auto"/>
-            <w:vAlign w:val="center"/>
+            <w:vAlign w:val="top"/>
             <w:hideMark/>
           </w:tcPr>
           <w:p>
@@ -506,6 +718,8 @@
             <w:r>
               <w:rPr>
                 <w:b/>
+                <w:color w:val="000000"/>
+                <w:sz w:val="20"/>
               </w:rPr>
               <w:t>SPACE 1.3</w:t>
             </w:r>
@@ -514,22 +728,78 @@
         <w:tc>
           <w:tcPr>
             <w:tcW w:w="0" w:type="auto"/>
-            <w:vAlign w:val="center"/>
+            <w:vAlign w:val="top"/>
             <w:hideMark/>
           </w:tcPr>
           <w:p>
             <w:pPr>
+              <w:keepLines/>
+              <w:spacing w:after="140"/>
+            </w:pPr>
+            <w:r>
+              <w:rPr>
+                <w:color w:val="000000"/>
+              </w:rPr>
+            </w:r>
+            <w:r>
+              <w:rPr>
+                <w:b/>
+                <w:color w:val="000000"/>
+                <w:sz w:val="21"/>
+              </w:rPr>
+              <w:t>Main screen</w:t>
+              <w:br/>
+            </w:r>
+            <w:r>
+              <w:rPr>
+                <w:color w:val="000000"/>
+                <w:sz w:val="21"/>
+              </w:rPr>
+              <w:t>A Project brings together the plants, observations and guidance for a real place. Areas organise different parts of that place.</w:t>
+            </w:r>
+          </w:p>
+          <w:p>
+            <w:pPr>
+              <w:keepLines/>
+              <w:spacing w:after="140"/>
+            </w:pPr>
+            <w:r>
+              <w:rPr>
+                <w:b/>
+                <w:color w:val="000000"/>
+                <w:sz w:val="21"/>
+              </w:rPr>
+              <w:t>Control panel info</w:t>
+              <w:br/>
+            </w:r>
+            <w:r>
+              <w:rPr>
+                <w:color w:val="000000"/>
+                <w:sz w:val="21"/>
+              </w:rPr>
+              <w:t>Start with an Area, add a Totem for orientation, then place Plant Orbs and Notes. In a full Project, you can publish a guide and keep its information current.</w:t>
+            </w:r>
+          </w:p>
+          <w:p>
+            <w:pPr>
+              <w:keepLines/>
               <w:spacing w:after="60"/>
+            </w:pPr>
+            <w:r>
               <w:rPr>
                 <w:b/>
-              </w:rPr>
-            </w:pPr>
-            <w:r>
-              <w:rPr>
-                <w:b/>
-                <w:bCs/>
-              </w:rPr>
-              <w:t>A Project brings together the plants, observations and guidance for a real place. Areas organise different parts of that place.</w:t>
+                <w:color w:val="000000"/>
+                <w:sz w:val="21"/>
+              </w:rPr>
+              <w:t>HINTS</w:t>
+              <w:br/>
+            </w:r>
+            <w:r>
+              <w:rPr>
+                <w:color w:val="000000"/>
+                <w:sz w:val="21"/>
+              </w:rPr>
+              <w:t>Use Continue below.</w:t>
             </w:r>
           </w:p>
         </w:tc>
@@ -537,11 +807,12 @@
       <w:tr>
         <w:trPr>
           <w:tblCellSpacing w:w="15" w:type="dxa"/>
+          <w:cantSplit/>
         </w:trPr>
         <w:tc>
           <w:tcPr>
             <w:tcW w:w="0" w:type="auto"/>
-            <w:vAlign w:val="center"/>
+            <w:vAlign w:val="top"/>
             <w:hideMark/>
           </w:tcPr>
           <w:p>
@@ -554,6 +825,8 @@
             <w:r>
               <w:rPr>
                 <w:b/>
+                <w:color w:val="000000"/>
+                <w:sz w:val="20"/>
               </w:rPr>
               <w:t>SPACE 1.4</w:t>
             </w:r>
@@ -562,22 +835,78 @@
         <w:tc>
           <w:tcPr>
             <w:tcW w:w="0" w:type="auto"/>
-            <w:vAlign w:val="center"/>
+            <w:vAlign w:val="top"/>
             <w:hideMark/>
           </w:tcPr>
           <w:p>
             <w:pPr>
+              <w:keepLines/>
+              <w:spacing w:after="140"/>
+            </w:pPr>
+            <w:r>
+              <w:rPr>
+                <w:color w:val="000000"/>
+              </w:rPr>
+            </w:r>
+            <w:r>
+              <w:rPr>
+                <w:b/>
+                <w:color w:val="000000"/>
+                <w:sz w:val="21"/>
+              </w:rPr>
+              <w:t>Main screen</w:t>
+              <w:br/>
+            </w:r>
+            <w:r>
+              <w:rPr>
+                <w:color w:val="000000"/>
+                <w:sz w:val="21"/>
+              </w:rPr>
+              <w:t>In this demo, you’ll explore two plants, add an observation and see how Areas connect.</w:t>
+            </w:r>
+          </w:p>
+          <w:p>
+            <w:pPr>
+              <w:keepLines/>
+              <w:spacing w:after="140"/>
+            </w:pPr>
+            <w:r>
+              <w:rPr>
+                <w:b/>
+                <w:color w:val="000000"/>
+                <w:sz w:val="21"/>
+              </w:rPr>
+              <w:t>Control panel info</w:t>
+              <w:br/>
+            </w:r>
+            <w:r>
+              <w:rPr>
+                <w:color w:val="000000"/>
+                <w:sz w:val="21"/>
+              </w:rPr>
+              <w:t>Selected plant information or Note options remain available; this section adds no fixed Control panel paragraph.</w:t>
+            </w:r>
+          </w:p>
+          <w:p>
+            <w:pPr>
+              <w:keepLines/>
               <w:spacing w:after="60"/>
+            </w:pPr>
+            <w:r>
               <w:rPr>
                 <w:b/>
-              </w:rPr>
-            </w:pPr>
-            <w:r>
-              <w:rPr>
-                <w:b/>
-                <w:bCs/>
-              </w:rPr>
-              <w:t>In this demo, you’ll explore two plants, add an observation and see how Areas connect.</w:t>
+                <w:color w:val="000000"/>
+                <w:sz w:val="21"/>
+              </w:rPr>
+              <w:t>HINTS</w:t>
+              <w:br/>
+            </w:r>
+            <w:r>
+              <w:rPr>
+                <w:color w:val="000000"/>
+                <w:sz w:val="21"/>
+              </w:rPr>
+              <w:t>Use See Area Totems below.</w:t>
             </w:r>
           </w:p>
         </w:tc>
@@ -585,11 +914,12 @@
       <w:tr>
         <w:trPr>
           <w:tblCellSpacing w:w="15" w:type="dxa"/>
+          <w:cantSplit/>
         </w:trPr>
         <w:tc>
           <w:tcPr>
             <w:tcW w:w="0" w:type="auto"/>
-            <w:vAlign w:val="center"/>
+            <w:vAlign w:val="top"/>
             <w:hideMark/>
           </w:tcPr>
           <w:p>
@@ -602,6 +932,8 @@
             <w:r>
               <w:rPr>
                 <w:b/>
+                <w:color w:val="000000"/>
+                <w:sz w:val="20"/>
               </w:rPr>
               <w:t>SPACE 1.5</w:t>
             </w:r>
@@ -610,22 +942,78 @@
         <w:tc>
           <w:tcPr>
             <w:tcW w:w="0" w:type="auto"/>
-            <w:vAlign w:val="center"/>
+            <w:vAlign w:val="top"/>
             <w:hideMark/>
           </w:tcPr>
           <w:p>
             <w:pPr>
+              <w:keepLines/>
+              <w:spacing w:after="140"/>
+            </w:pPr>
+            <w:r>
+              <w:rPr>
+                <w:color w:val="000000"/>
+              </w:rPr>
+            </w:r>
+            <w:r>
+              <w:rPr>
+                <w:b/>
+                <w:color w:val="000000"/>
+                <w:sz w:val="21"/>
+              </w:rPr>
+              <w:t>Main screen</w:t>
+              <w:br/>
+            </w:r>
+            <w:r>
+              <w:rPr>
+                <w:color w:val="000000"/>
+                <w:sz w:val="21"/>
+              </w:rPr>
+              <w:t>The same place can support a visitor’s curiosity, a school activity or a land steward’s work.</w:t>
+            </w:r>
+          </w:p>
+          <w:p>
+            <w:pPr>
+              <w:keepLines/>
+              <w:spacing w:after="140"/>
+            </w:pPr>
+            <w:r>
+              <w:rPr>
+                <w:b/>
+                <w:color w:val="000000"/>
+                <w:sz w:val="21"/>
+              </w:rPr>
+              <w:t>Control panel info</w:t>
+              <w:br/>
+            </w:r>
+            <w:r>
+              <w:rPr>
+                <w:color w:val="000000"/>
+                <w:sz w:val="21"/>
+              </w:rPr>
+              <w:t>The selected learning connection remains available; this section adds no fixed Control panel paragraph.</w:t>
+            </w:r>
+          </w:p>
+          <w:p>
+            <w:pPr>
+              <w:keepLines/>
               <w:spacing w:after="60"/>
+            </w:pPr>
+            <w:r>
               <w:rPr>
                 <w:b/>
-              </w:rPr>
-            </w:pPr>
-            <w:r>
-              <w:rPr>
-                <w:b/>
-                <w:bCs/>
-              </w:rPr>
-              <w:t>The same place can support a visitor’s curiosity, a school activity or a land steward’s work.</w:t>
+                <w:color w:val="000000"/>
+                <w:sz w:val="21"/>
+              </w:rPr>
+              <w:t>HINTS</w:t>
+              <w:br/>
+            </w:r>
+            <w:r>
+              <w:rPr>
+                <w:color w:val="000000"/>
+                <w:sz w:val="21"/>
+              </w:rPr>
+              <w:t>Use See the connected result below.</w:t>
             </w:r>
           </w:p>
         </w:tc>
@@ -633,11 +1021,12 @@
       <w:tr>
         <w:trPr>
           <w:tblCellSpacing w:w="15" w:type="dxa"/>
+          <w:cantSplit/>
         </w:trPr>
         <w:tc>
           <w:tcPr>
             <w:tcW w:w="0" w:type="auto"/>
-            <w:vAlign w:val="center"/>
+            <w:vAlign w:val="top"/>
             <w:hideMark/>
           </w:tcPr>
           <w:p>
@@ -650,6 +1039,8 @@
             <w:r>
               <w:rPr>
                 <w:b/>
+                <w:color w:val="000000"/>
+                <w:sz w:val="20"/>
               </w:rPr>
               <w:t>ELEMENTS 1.1</w:t>
             </w:r>
@@ -658,22 +1049,78 @@
         <w:tc>
           <w:tcPr>
             <w:tcW w:w="0" w:type="auto"/>
-            <w:vAlign w:val="center"/>
+            <w:vAlign w:val="top"/>
             <w:hideMark/>
           </w:tcPr>
           <w:p>
             <w:pPr>
+              <w:keepLines/>
+              <w:spacing w:after="140"/>
+            </w:pPr>
+            <w:r>
+              <w:rPr>
+                <w:color w:val="000000"/>
+              </w:rPr>
+            </w:r>
+            <w:r>
+              <w:rPr>
+                <w:b/>
+                <w:color w:val="000000"/>
+                <w:sz w:val="21"/>
+              </w:rPr>
+              <w:t>Main screen</w:t>
+              <w:br/>
+            </w:r>
+            <w:r>
+              <w:rPr>
+                <w:color w:val="000000"/>
+                <w:sz w:val="21"/>
+              </w:rPr>
+              <w:t>A plant profile brings together its identity, ecology, care and uses, alongside local knowledge and sources.</w:t>
+            </w:r>
+          </w:p>
+          <w:p>
+            <w:pPr>
+              <w:keepLines/>
+              <w:spacing w:after="140"/>
+            </w:pPr>
+            <w:r>
+              <w:rPr>
+                <w:b/>
+                <w:color w:val="000000"/>
+                <w:sz w:val="21"/>
+              </w:rPr>
+              <w:t>Control panel info</w:t>
+              <w:br/>
+            </w:r>
+            <w:r>
+              <w:rPr>
+                <w:color w:val="000000"/>
+                <w:sz w:val="21"/>
+              </w:rPr>
+              <w:t>The Control panel remains available. No new body text or tutorial photo is introduced at this step.</w:t>
+            </w:r>
+          </w:p>
+          <w:p>
+            <w:pPr>
+              <w:keepLines/>
               <w:spacing w:after="60"/>
+            </w:pPr>
+            <w:r>
               <w:rPr>
                 <w:b/>
-              </w:rPr>
-            </w:pPr>
-            <w:r>
-              <w:rPr>
-                <w:b/>
-                <w:bCs/>
-              </w:rPr>
-              <w:t>A plant profile brings together its identity, ecology, care and uses, alongside local knowledge and sources.</w:t>
+                <w:color w:val="000000"/>
+                <w:sz w:val="21"/>
+              </w:rPr>
+              <w:t>HINTS</w:t>
+              <w:br/>
+            </w:r>
+            <w:r>
+              <w:rPr>
+                <w:color w:val="000000"/>
+                <w:sz w:val="21"/>
+              </w:rPr>
+              <w:t>Use Continue below.</w:t>
             </w:r>
           </w:p>
         </w:tc>
@@ -681,11 +1128,12 @@
       <w:tr>
         <w:trPr>
           <w:tblCellSpacing w:w="15" w:type="dxa"/>
+          <w:cantSplit/>
         </w:trPr>
         <w:tc>
           <w:tcPr>
             <w:tcW w:w="0" w:type="auto"/>
-            <w:vAlign w:val="center"/>
+            <w:vAlign w:val="top"/>
             <w:hideMark/>
           </w:tcPr>
           <w:p>
@@ -698,6 +1146,8 @@
             <w:r>
               <w:rPr>
                 <w:b/>
+                <w:color w:val="000000"/>
+                <w:sz w:val="20"/>
               </w:rPr>
               <w:t>ELEMENTS 1.2</w:t>
             </w:r>
@@ -706,22 +1156,78 @@
         <w:tc>
           <w:tcPr>
             <w:tcW w:w="0" w:type="auto"/>
-            <w:vAlign w:val="center"/>
+            <w:vAlign w:val="top"/>
             <w:hideMark/>
           </w:tcPr>
           <w:p>
             <w:pPr>
+              <w:keepLines/>
+              <w:spacing w:after="140"/>
+            </w:pPr>
+            <w:r>
+              <w:rPr>
+                <w:color w:val="000000"/>
+              </w:rPr>
+            </w:r>
+            <w:r>
+              <w:rPr>
+                <w:b/>
+                <w:color w:val="000000"/>
+                <w:sz w:val="21"/>
+              </w:rPr>
+              <w:t>Main screen</w:t>
+              <w:br/>
+            </w:r>
+            <w:r>
+              <w:rPr>
+                <w:color w:val="000000"/>
+                <w:sz w:val="21"/>
+              </w:rPr>
+              <w:t>Totem signs help you find your way through an Area, pointing towards plants, Notes and other Areas.</w:t>
+            </w:r>
+          </w:p>
+          <w:p>
+            <w:pPr>
+              <w:keepLines/>
+              <w:spacing w:after="140"/>
+            </w:pPr>
+            <w:r>
+              <w:rPr>
+                <w:b/>
+                <w:color w:val="000000"/>
+                <w:sz w:val="21"/>
+              </w:rPr>
+              <w:t>Control panel info</w:t>
+              <w:br/>
+            </w:r>
+            <w:r>
+              <w:rPr>
+                <w:color w:val="000000"/>
+                <w:sz w:val="21"/>
+              </w:rPr>
+              <w:t>The Control panel remains available beside the Area illustration. No new fixed body text is shown.</w:t>
+            </w:r>
+          </w:p>
+          <w:p>
+            <w:pPr>
+              <w:keepLines/>
               <w:spacing w:after="60"/>
+            </w:pPr>
+            <w:r>
               <w:rPr>
                 <w:b/>
-              </w:rPr>
-            </w:pPr>
-            <w:r>
-              <w:rPr>
-                <w:b/>
-                <w:bCs/>
-              </w:rPr>
-              <w:t>Totem signs help you find your way through an Area, pointing towards plants, Notes and other Areas.</w:t>
+                <w:color w:val="000000"/>
+                <w:sz w:val="21"/>
+              </w:rPr>
+              <w:t>HINTS</w:t>
+              <w:br/>
+            </w:r>
+            <w:r>
+              <w:rPr>
+                <w:color w:val="000000"/>
+                <w:sz w:val="21"/>
+              </w:rPr>
+              <w:t>Use Continue below.</w:t>
             </w:r>
           </w:p>
         </w:tc>
@@ -729,11 +1235,12 @@
       <w:tr>
         <w:trPr>
           <w:tblCellSpacing w:w="15" w:type="dxa"/>
+          <w:cantSplit/>
         </w:trPr>
         <w:tc>
           <w:tcPr>
             <w:tcW w:w="0" w:type="auto"/>
-            <w:vAlign w:val="center"/>
+            <w:vAlign w:val="top"/>
             <w:hideMark/>
           </w:tcPr>
           <w:p>
@@ -746,6 +1253,8 @@
             <w:r>
               <w:rPr>
                 <w:b/>
+                <w:color w:val="000000"/>
+                <w:sz w:val="20"/>
               </w:rPr>
               <w:t>ELEMENTS 1.3</w:t>
             </w:r>
@@ -754,22 +1263,78 @@
         <w:tc>
           <w:tcPr>
             <w:tcW w:w="0" w:type="auto"/>
-            <w:vAlign w:val="center"/>
+            <w:vAlign w:val="top"/>
             <w:hideMark/>
           </w:tcPr>
           <w:p>
             <w:pPr>
+              <w:keepLines/>
+              <w:spacing w:after="140"/>
+            </w:pPr>
+            <w:r>
+              <w:rPr>
+                <w:color w:val="000000"/>
+              </w:rPr>
+            </w:r>
+            <w:r>
+              <w:rPr>
+                <w:b/>
+                <w:color w:val="000000"/>
+                <w:sz w:val="21"/>
+              </w:rPr>
+              <w:t>Main screen</w:t>
+              <w:br/>
+            </w:r>
+            <w:r>
+              <w:rPr>
+                <w:color w:val="000000"/>
+                <w:sz w:val="21"/>
+              </w:rPr>
+              <w:t>Start with Pigeon Pea. Aim at the plant, or choose a location for its digital tag.</w:t>
+            </w:r>
+          </w:p>
+          <w:p>
+            <w:pPr>
+              <w:keepLines/>
+              <w:spacing w:after="140"/>
+            </w:pPr>
+            <w:r>
+              <w:rPr>
+                <w:b/>
+                <w:color w:val="000000"/>
+                <w:sz w:val="21"/>
+              </w:rPr>
+              <w:t>Control panel info</w:t>
+              <w:br/>
+            </w:r>
+            <w:r>
+              <w:rPr>
+                <w:color w:val="000000"/>
+                <w:sz w:val="21"/>
+              </w:rPr>
+              <w:t>Placement controls remain available; plant media stays closed until plant information is opened.</w:t>
+            </w:r>
+          </w:p>
+          <w:p>
+            <w:pPr>
+              <w:keepLines/>
               <w:spacing w:after="60"/>
+            </w:pPr>
+            <w:r>
               <w:rPr>
                 <w:b/>
-              </w:rPr>
-            </w:pPr>
-            <w:r>
-              <w:rPr>
-                <w:b/>
-                <w:bCs/>
-              </w:rPr>
-              <w:t>Start with Pigeon Pea. Aim at the plant, or choose a location for its digital tag.</w:t>
+                <w:color w:val="000000"/>
+                <w:sz w:val="21"/>
+              </w:rPr>
+              <w:t>HINTS</w:t>
+              <w:br/>
+            </w:r>
+            <w:r>
+              <w:rPr>
+                <w:color w:val="000000"/>
+                <w:sz w:val="21"/>
+              </w:rPr>
+              <w:t>Aim toward the plant or tag location. Use the right joystick up or down to adjust distance.</w:t>
             </w:r>
           </w:p>
         </w:tc>
@@ -777,11 +1342,12 @@
       <w:tr>
         <w:trPr>
           <w:tblCellSpacing w:w="15" w:type="dxa"/>
+          <w:cantSplit/>
         </w:trPr>
         <w:tc>
           <w:tcPr>
             <w:tcW w:w="0" w:type="auto"/>
-            <w:vAlign w:val="center"/>
+            <w:vAlign w:val="top"/>
             <w:hideMark/>
           </w:tcPr>
           <w:p>
@@ -794,6 +1360,8 @@
             <w:r>
               <w:rPr>
                 <w:b/>
+                <w:color w:val="000000"/>
+                <w:sz w:val="20"/>
               </w:rPr>
               <w:t>ELEMENTS 1.4</w:t>
             </w:r>
@@ -802,22 +1370,78 @@
         <w:tc>
           <w:tcPr>
             <w:tcW w:w="0" w:type="auto"/>
-            <w:vAlign w:val="center"/>
+            <w:vAlign w:val="top"/>
             <w:hideMark/>
           </w:tcPr>
           <w:p>
             <w:pPr>
+              <w:keepLines/>
+              <w:spacing w:after="140"/>
+            </w:pPr>
+            <w:r>
+              <w:rPr>
+                <w:color w:val="000000"/>
+              </w:rPr>
+            </w:r>
+            <w:r>
+              <w:rPr>
+                <w:b/>
+                <w:color w:val="000000"/>
+                <w:sz w:val="21"/>
+              </w:rPr>
+              <w:t>Main screen</w:t>
+              <w:br/>
+            </w:r>
+            <w:r>
+              <w:rPr>
+                <w:color w:val="000000"/>
+                <w:sz w:val="21"/>
+              </w:rPr>
+              <w:t>The tag connects this plant profile to a location in the landscape.</w:t>
+            </w:r>
+          </w:p>
+          <w:p>
+            <w:pPr>
+              <w:keepLines/>
+              <w:spacing w:after="140"/>
+            </w:pPr>
+            <w:r>
+              <w:rPr>
+                <w:b/>
+                <w:color w:val="000000"/>
+                <w:sz w:val="21"/>
+              </w:rPr>
+              <w:t>Control panel info</w:t>
+              <w:br/>
+            </w:r>
+            <w:r>
+              <w:rPr>
+                <w:color w:val="000000"/>
+                <w:sz w:val="21"/>
+              </w:rPr>
+              <w:t>Placement controls remain available. No new fixed body text is shown.</w:t>
+            </w:r>
+          </w:p>
+          <w:p>
+            <w:pPr>
+              <w:keepLines/>
               <w:spacing w:after="60"/>
+            </w:pPr>
+            <w:r>
               <w:rPr>
                 <w:b/>
-              </w:rPr>
-            </w:pPr>
-            <w:r>
-              <w:rPr>
-                <w:b/>
-                <w:bCs/>
-              </w:rPr>
-              <w:t>The tag connects this plant profile to a location in the landscape.</w:t>
+                <w:color w:val="000000"/>
+                <w:sz w:val="21"/>
+              </w:rPr>
+              <w:t>HINTS</w:t>
+              <w:br/>
+            </w:r>
+            <w:r>
+              <w:rPr>
+                <w:color w:val="000000"/>
+                <w:sz w:val="21"/>
+              </w:rPr>
+              <w:t>Use Continue below.</w:t>
             </w:r>
           </w:p>
         </w:tc>
@@ -825,11 +1449,12 @@
       <w:tr>
         <w:trPr>
           <w:tblCellSpacing w:w="15" w:type="dxa"/>
+          <w:cantSplit/>
         </w:trPr>
         <w:tc>
           <w:tcPr>
             <w:tcW w:w="0" w:type="auto"/>
-            <w:vAlign w:val="center"/>
+            <w:vAlign w:val="top"/>
             <w:hideMark/>
           </w:tcPr>
           <w:p>
@@ -842,6 +1467,8 @@
             <w:r>
               <w:rPr>
                 <w:b/>
+                <w:color w:val="000000"/>
+                <w:sz w:val="20"/>
               </w:rPr>
               <w:t>ELEMENTS 1.5</w:t>
             </w:r>
@@ -850,22 +1477,78 @@
         <w:tc>
           <w:tcPr>
             <w:tcW w:w="0" w:type="auto"/>
-            <w:vAlign w:val="center"/>
+            <w:vAlign w:val="top"/>
             <w:hideMark/>
           </w:tcPr>
           <w:p>
             <w:pPr>
+              <w:keepLines/>
+              <w:spacing w:after="140"/>
+            </w:pPr>
+            <w:r>
+              <w:rPr>
+                <w:color w:val="000000"/>
+              </w:rPr>
+            </w:r>
+            <w:r>
+              <w:rPr>
+                <w:b/>
+                <w:color w:val="000000"/>
+                <w:sz w:val="21"/>
+              </w:rPr>
+              <w:t>Main screen</w:t>
+              <w:br/>
+            </w:r>
+            <w:r>
+              <w:rPr>
+                <w:color w:val="000000"/>
+                <w:sz w:val="21"/>
+              </w:rPr>
+              <w:t>Adjust the tag’s distance, then confirm its position.</w:t>
+            </w:r>
+          </w:p>
+          <w:p>
+            <w:pPr>
+              <w:keepLines/>
+              <w:spacing w:after="140"/>
+            </w:pPr>
+            <w:r>
+              <w:rPr>
+                <w:b/>
+                <w:color w:val="000000"/>
+                <w:sz w:val="21"/>
+              </w:rPr>
+              <w:t>Control panel info</w:t>
+              <w:br/>
+            </w:r>
+            <w:r>
+              <w:rPr>
+                <w:color w:val="000000"/>
+                <w:sz w:val="21"/>
+              </w:rPr>
+              <w:t>Place Pigeon Pea. A Plant Orb attaches this plant’s information to a real place. Pigeon Pea is our first example.</w:t>
+            </w:r>
+          </w:p>
+          <w:p>
+            <w:pPr>
+              <w:keepLines/>
               <w:spacing w:after="60"/>
+            </w:pPr>
+            <w:r>
               <w:rPr>
                 <w:b/>
-              </w:rPr>
-            </w:pPr>
-            <w:r>
-              <w:rPr>
-                <w:b/>
-                <w:bCs/>
-              </w:rPr>
-              <w:t>Adjust the tag’s distance, then confirm its position.</w:t>
+                <w:color w:val="000000"/>
+                <w:sz w:val="21"/>
+              </w:rPr>
+              <w:t>HINTS</w:t>
+              <w:br/>
+            </w:r>
+            <w:r>
+              <w:rPr>
+                <w:color w:val="000000"/>
+                <w:sz w:val="21"/>
+              </w:rPr>
+              <w:t>Aim at the real plant or desired tag location, then press the controller trigger to place it. Use the right joystick to adjust distance.</w:t>
             </w:r>
           </w:p>
         </w:tc>
@@ -873,11 +1556,12 @@
       <w:tr>
         <w:trPr>
           <w:tblCellSpacing w:w="15" w:type="dxa"/>
+          <w:cantSplit/>
         </w:trPr>
         <w:tc>
           <w:tcPr>
             <w:tcW w:w="0" w:type="auto"/>
-            <w:vAlign w:val="center"/>
+            <w:vAlign w:val="top"/>
             <w:hideMark/>
           </w:tcPr>
           <w:p>
@@ -890,6 +1574,8 @@
             <w:r>
               <w:rPr>
                 <w:b/>
+                <w:color w:val="000000"/>
+                <w:sz w:val="20"/>
               </w:rPr>
               <w:t>ELEMENTS 1.6</w:t>
             </w:r>
@@ -898,22 +1584,78 @@
         <w:tc>
           <w:tcPr>
             <w:tcW w:w="0" w:type="auto"/>
-            <w:vAlign w:val="center"/>
+            <w:vAlign w:val="top"/>
             <w:hideMark/>
           </w:tcPr>
           <w:p>
             <w:pPr>
+              <w:keepLines/>
+              <w:spacing w:after="140"/>
+            </w:pPr>
+            <w:r>
+              <w:rPr>
+                <w:color w:val="000000"/>
+              </w:rPr>
+            </w:r>
+            <w:r>
+              <w:rPr>
+                <w:b/>
+                <w:color w:val="000000"/>
+                <w:sz w:val="21"/>
+              </w:rPr>
+              <w:t>Main screen</w:t>
+              <w:br/>
+            </w:r>
+            <w:r>
+              <w:rPr>
+                <w:color w:val="000000"/>
+                <w:sz w:val="21"/>
+              </w:rPr>
+              <w:t>This digital tag is a Plant Orb. Select it to open the plant profile, or hold it to move it.</w:t>
+            </w:r>
+          </w:p>
+          <w:p>
+            <w:pPr>
+              <w:keepLines/>
+              <w:spacing w:after="140"/>
+            </w:pPr>
+            <w:r>
+              <w:rPr>
+                <w:b/>
+                <w:color w:val="000000"/>
+                <w:sz w:val="21"/>
+              </w:rPr>
+              <w:t>Control panel info</w:t>
+              <w:br/>
+            </w:r>
+            <w:r>
+              <w:rPr>
+                <w:color w:val="000000"/>
+                <w:sz w:val="21"/>
+              </w:rPr>
+              <w:t>Plant information opens after the Orb is selected. No fixed paragraph replaces the current selection.</w:t>
+            </w:r>
+          </w:p>
+          <w:p>
+            <w:pPr>
+              <w:keepLines/>
               <w:spacing w:after="60"/>
+            </w:pPr>
+            <w:r>
               <w:rPr>
                 <w:b/>
-              </w:rPr>
-            </w:pPr>
-            <w:r>
-              <w:rPr>
-                <w:b/>
-                <w:bCs/>
-              </w:rPr>
-              <w:t>This digital tag is a Plant Orb. Select it to open the plant profile, or hold it to move it.</w:t>
+                <w:color w:val="000000"/>
+                <w:sz w:val="21"/>
+              </w:rPr>
+              <w:t>HINTS</w:t>
+              <w:br/>
+            </w:r>
+            <w:r>
+              <w:rPr>
+                <w:color w:val="000000"/>
+                <w:sz w:val="21"/>
+              </w:rPr>
+              <w:t>Press the Plant Orb to open its information. Press and hold it to move it.</w:t>
             </w:r>
           </w:p>
         </w:tc>
@@ -921,11 +1663,12 @@
       <w:tr>
         <w:trPr>
           <w:tblCellSpacing w:w="15" w:type="dxa"/>
+          <w:cantSplit/>
         </w:trPr>
         <w:tc>
           <w:tcPr>
             <w:tcW w:w="0" w:type="auto"/>
-            <w:vAlign w:val="center"/>
+            <w:vAlign w:val="top"/>
             <w:hideMark/>
           </w:tcPr>
           <w:p>
@@ -938,6 +1681,8 @@
             <w:r>
               <w:rPr>
                 <w:b/>
+                <w:color w:val="000000"/>
+                <w:sz w:val="20"/>
               </w:rPr>
               <w:t>ELEMENTS 1.7</w:t>
             </w:r>
@@ -946,22 +1691,78 @@
         <w:tc>
           <w:tcPr>
             <w:tcW w:w="0" w:type="auto"/>
-            <w:vAlign w:val="center"/>
+            <w:vAlign w:val="top"/>
             <w:hideMark/>
           </w:tcPr>
           <w:p>
             <w:pPr>
+              <w:keepLines/>
+              <w:spacing w:after="140"/>
+            </w:pPr>
+            <w:r>
+              <w:rPr>
+                <w:color w:val="000000"/>
+              </w:rPr>
+            </w:r>
+            <w:r>
+              <w:rPr>
+                <w:b/>
+                <w:color w:val="000000"/>
+                <w:sz w:val="21"/>
+              </w:rPr>
+              <w:t>Main screen</w:t>
+              <w:br/>
+            </w:r>
+            <w:r>
+              <w:rPr>
+                <w:color w:val="000000"/>
+                <w:sz w:val="21"/>
+              </w:rPr>
+              <w:t>Explore Pigeon Pea’s information cells to discover its characteristics and roles.</w:t>
+            </w:r>
+          </w:p>
+          <w:p>
+            <w:pPr>
+              <w:keepLines/>
+              <w:spacing w:after="140"/>
+            </w:pPr>
+            <w:r>
+              <w:rPr>
+                <w:b/>
+                <w:color w:val="000000"/>
+                <w:sz w:val="21"/>
+              </w:rPr>
+              <w:t>Control panel info</w:t>
+              <w:br/>
+            </w:r>
+            <w:r>
+              <w:rPr>
+                <w:color w:val="000000"/>
+                <w:sz w:val="21"/>
+              </w:rPr>
+              <w:t>The selected Pigeon Pea information cell opens here. Its path, body and sources depend on the cell selected.</w:t>
+            </w:r>
+          </w:p>
+          <w:p>
+            <w:pPr>
+              <w:keepLines/>
               <w:spacing w:after="60"/>
+            </w:pPr>
+            <w:r>
               <w:rPr>
                 <w:b/>
-              </w:rPr>
-            </w:pPr>
-            <w:r>
-              <w:rPr>
-                <w:b/>
-                <w:bCs/>
-              </w:rPr>
-              <w:t>Explore Pigeon Pea’s information cells to discover its characteristics and roles.</w:t>
+                <w:color w:val="000000"/>
+                <w:sz w:val="21"/>
+              </w:rPr>
+              <w:t>HINTS</w:t>
+              <w:br/>
+            </w:r>
+            <w:r>
+              <w:rPr>
+                <w:color w:val="000000"/>
+                <w:sz w:val="21"/>
+              </w:rPr>
+              <w:t>Press and hold the Orb to move it. While holding it, move the right joystick to bring it closer or further away. Press a cell once to expand plant information.</w:t>
             </w:r>
           </w:p>
         </w:tc>
@@ -969,11 +1770,12 @@
       <w:tr>
         <w:trPr>
           <w:tblCellSpacing w:w="15" w:type="dxa"/>
+          <w:cantSplit/>
         </w:trPr>
         <w:tc>
           <w:tcPr>
             <w:tcW w:w="0" w:type="auto"/>
-            <w:vAlign w:val="center"/>
+            <w:vAlign w:val="top"/>
             <w:hideMark/>
           </w:tcPr>
           <w:p>
@@ -986,6 +1788,8 @@
             <w:r>
               <w:rPr>
                 <w:b/>
+                <w:color w:val="000000"/>
+                <w:sz w:val="20"/>
               </w:rPr>
               <w:t>ELEMENTS 1.8</w:t>
             </w:r>
@@ -994,22 +1798,78 @@
         <w:tc>
           <w:tcPr>
             <w:tcW w:w="0" w:type="auto"/>
-            <w:vAlign w:val="center"/>
+            <w:vAlign w:val="top"/>
             <w:hideMark/>
           </w:tcPr>
           <w:p>
             <w:pPr>
+              <w:keepLines/>
+              <w:spacing w:after="140"/>
+            </w:pPr>
+            <w:r>
+              <w:rPr>
+                <w:color w:val="000000"/>
+              </w:rPr>
+            </w:r>
+            <w:r>
+              <w:rPr>
+                <w:b/>
+                <w:color w:val="000000"/>
+                <w:sz w:val="21"/>
+              </w:rPr>
+              <w:t>Main screen</w:t>
+              <w:br/>
+            </w:r>
+            <w:r>
+              <w:rPr>
+                <w:color w:val="000000"/>
+                <w:sz w:val="21"/>
+              </w:rPr>
+              <w:t>The same plant profile is also available in Web Mode, as a standard browser page.</w:t>
+            </w:r>
+          </w:p>
+          <w:p>
+            <w:pPr>
+              <w:keepLines/>
+              <w:spacing w:after="140"/>
+            </w:pPr>
+            <w:r>
+              <w:rPr>
+                <w:b/>
+                <w:color w:val="000000"/>
+                <w:sz w:val="21"/>
+              </w:rPr>
+              <w:t>Control panel info</w:t>
+              <w:br/>
+            </w:r>
+            <w:r>
+              <w:rPr>
+                <w:color w:val="000000"/>
+                <w:sz w:val="21"/>
+              </w:rPr>
+              <w:t>The currently selected plant information remains available in the Control panel.</w:t>
+            </w:r>
+          </w:p>
+          <w:p>
+            <w:pPr>
+              <w:keepLines/>
               <w:spacing w:after="60"/>
+            </w:pPr>
+            <w:r>
               <w:rPr>
                 <w:b/>
-              </w:rPr>
-            </w:pPr>
-            <w:r>
-              <w:rPr>
-                <w:b/>
-                <w:bCs/>
-              </w:rPr>
-              <w:t>The same plant profile is also available in Web Mode, as a standard browser page.</w:t>
+                <w:color w:val="000000"/>
+                <w:sz w:val="21"/>
+              </w:rPr>
+              <w:t>HINTS</w:t>
+              <w:br/>
+            </w:r>
+            <w:r>
+              <w:rPr>
+                <w:color w:val="000000"/>
+                <w:sz w:val="21"/>
+              </w:rPr>
+              <w:t>Use Continue below.</w:t>
             </w:r>
           </w:p>
         </w:tc>
@@ -1017,11 +1877,12 @@
       <w:tr>
         <w:trPr>
           <w:tblCellSpacing w:w="15" w:type="dxa"/>
+          <w:cantSplit/>
         </w:trPr>
         <w:tc>
           <w:tcPr>
             <w:tcW w:w="0" w:type="auto"/>
-            <w:vAlign w:val="center"/>
+            <w:vAlign w:val="top"/>
             <w:hideMark/>
           </w:tcPr>
           <w:p>
@@ -1034,6 +1895,8 @@
             <w:r>
               <w:rPr>
                 <w:b/>
+                <w:color w:val="000000"/>
+                <w:sz w:val="20"/>
               </w:rPr>
               <w:t>ELEMENTS 1.9</w:t>
             </w:r>
@@ -1042,22 +1905,78 @@
         <w:tc>
           <w:tcPr>
             <w:tcW w:w="0" w:type="auto"/>
-            <w:vAlign w:val="center"/>
+            <w:vAlign w:val="top"/>
             <w:hideMark/>
           </w:tcPr>
           <w:p>
             <w:pPr>
+              <w:keepLines/>
+              <w:spacing w:after="140"/>
+            </w:pPr>
+            <w:r>
+              <w:rPr>
+                <w:color w:val="000000"/>
+              </w:rPr>
+            </w:r>
+            <w:r>
+              <w:rPr>
+                <w:b/>
+                <w:color w:val="000000"/>
+                <w:sz w:val="21"/>
+              </w:rPr>
+              <w:t>Main screen</w:t>
+              <w:br/>
+            </w:r>
+            <w:r>
+              <w:rPr>
+                <w:color w:val="000000"/>
+                <w:sz w:val="21"/>
+              </w:rPr>
+              <w:t>Which of these characteristics could matter in this garden? Keep one in mind as you explore.</w:t>
+            </w:r>
+          </w:p>
+          <w:p>
+            <w:pPr>
+              <w:keepLines/>
+              <w:spacing w:after="140"/>
+            </w:pPr>
+            <w:r>
+              <w:rPr>
+                <w:b/>
+                <w:color w:val="000000"/>
+                <w:sz w:val="21"/>
+              </w:rPr>
+              <w:t>Control panel info</w:t>
+              <w:br/>
+            </w:r>
+            <w:r>
+              <w:rPr>
+                <w:color w:val="000000"/>
+                <w:sz w:val="21"/>
+              </w:rPr>
+              <w:t>The currently selected plant information remains available; this section adds no fixed paragraph.</w:t>
+            </w:r>
+          </w:p>
+          <w:p>
+            <w:pPr>
+              <w:keepLines/>
               <w:spacing w:after="60"/>
+            </w:pPr>
+            <w:r>
               <w:rPr>
                 <w:b/>
-              </w:rPr>
-            </w:pPr>
-            <w:r>
-              <w:rPr>
-                <w:b/>
-                <w:bCs/>
-              </w:rPr>
-              <w:t>Which of these characteristics could matter in this garden? Keep one in mind as you explore.</w:t>
+                <w:color w:val="000000"/>
+                <w:sz w:val="21"/>
+              </w:rPr>
+              <w:t>HINTS</w:t>
+              <w:br/>
+            </w:r>
+            <w:r>
+              <w:rPr>
+                <w:color w:val="000000"/>
+                <w:sz w:val="21"/>
+              </w:rPr>
+              <w:t>Use Continue below.</w:t>
             </w:r>
           </w:p>
         </w:tc>
@@ -1065,11 +1984,12 @@
       <w:tr>
         <w:trPr>
           <w:tblCellSpacing w:w="15" w:type="dxa"/>
+          <w:cantSplit/>
         </w:trPr>
         <w:tc>
           <w:tcPr>
             <w:tcW w:w="0" w:type="auto"/>
-            <w:vAlign w:val="center"/>
+            <w:vAlign w:val="top"/>
             <w:hideMark/>
           </w:tcPr>
           <w:p>
@@ -1082,6 +2002,8 @@
             <w:r>
               <w:rPr>
                 <w:b/>
+                <w:color w:val="000000"/>
+                <w:sz w:val="20"/>
               </w:rPr>
               <w:t>ELEMENTS 1.10</w:t>
             </w:r>
@@ -1090,22 +2012,78 @@
         <w:tc>
           <w:tcPr>
             <w:tcW w:w="0" w:type="auto"/>
-            <w:vAlign w:val="center"/>
+            <w:vAlign w:val="top"/>
             <w:hideMark/>
           </w:tcPr>
           <w:p>
             <w:pPr>
+              <w:keepLines/>
+              <w:spacing w:after="140"/>
+            </w:pPr>
+            <w:r>
+              <w:rPr>
+                <w:color w:val="000000"/>
+              </w:rPr>
+            </w:r>
+            <w:r>
+              <w:rPr>
+                <w:b/>
+                <w:color w:val="000000"/>
+                <w:sz w:val="21"/>
+              </w:rPr>
+              <w:t>Main screen</w:t>
+              <w:br/>
+            </w:r>
+            <w:r>
+              <w:rPr>
+                <w:color w:val="000000"/>
+                <w:sz w:val="21"/>
+              </w:rPr>
+              <w:t>Now meet Moringa. Compare its characteristics with Pigeon Pea and consider the different roles they might play here.</w:t>
+            </w:r>
+          </w:p>
+          <w:p>
+            <w:pPr>
+              <w:keepLines/>
+              <w:spacing w:after="140"/>
+            </w:pPr>
+            <w:r>
+              <w:rPr>
+                <w:b/>
+                <w:color w:val="000000"/>
+                <w:sz w:val="21"/>
+              </w:rPr>
+              <w:t>Control panel info</w:t>
+              <w:br/>
+            </w:r>
+            <w:r>
+              <w:rPr>
+                <w:color w:val="000000"/>
+                <w:sz w:val="21"/>
+              </w:rPr>
+              <w:t>Placement controls remain available; Moringa’s photo opens only when its information is selected.</w:t>
+            </w:r>
+          </w:p>
+          <w:p>
+            <w:pPr>
+              <w:keepLines/>
               <w:spacing w:after="60"/>
+            </w:pPr>
+            <w:r>
               <w:rPr>
                 <w:b/>
-              </w:rPr>
-            </w:pPr>
-            <w:r>
-              <w:rPr>
-                <w:b/>
-                <w:bCs/>
-              </w:rPr>
-              <w:t>Now meet Moringa. Compare its characteristics with Pigeon Pea and consider the different roles they might play here.</w:t>
+                <w:color w:val="000000"/>
+                <w:sz w:val="21"/>
+              </w:rPr>
+              <w:t>HINTS</w:t>
+              <w:br/>
+            </w:r>
+            <w:r>
+              <w:rPr>
+                <w:color w:val="000000"/>
+                <w:sz w:val="21"/>
+              </w:rPr>
+              <w:t>Use Continue below.</w:t>
             </w:r>
           </w:p>
         </w:tc>
@@ -1113,11 +2091,12 @@
       <w:tr>
         <w:trPr>
           <w:tblCellSpacing w:w="15" w:type="dxa"/>
+          <w:cantSplit/>
         </w:trPr>
         <w:tc>
           <w:tcPr>
             <w:tcW w:w="0" w:type="auto"/>
-            <w:vAlign w:val="center"/>
+            <w:vAlign w:val="top"/>
             <w:hideMark/>
           </w:tcPr>
           <w:p>
@@ -1130,6 +2109,8 @@
             <w:r>
               <w:rPr>
                 <w:b/>
+                <w:color w:val="000000"/>
+                <w:sz w:val="20"/>
               </w:rPr>
               <w:t>ELEMENTS 1.12</w:t>
             </w:r>
@@ -1138,22 +2119,78 @@
         <w:tc>
           <w:tcPr>
             <w:tcW w:w="0" w:type="auto"/>
-            <w:vAlign w:val="center"/>
+            <w:vAlign w:val="top"/>
             <w:hideMark/>
           </w:tcPr>
           <w:p>
             <w:pPr>
+              <w:keepLines/>
+              <w:spacing w:after="140"/>
+            </w:pPr>
+            <w:r>
+              <w:rPr>
+                <w:color w:val="000000"/>
+              </w:rPr>
+            </w:r>
+            <w:r>
+              <w:rPr>
+                <w:b/>
+                <w:color w:val="000000"/>
+                <w:sz w:val="21"/>
+              </w:rPr>
+              <w:t>Main screen</w:t>
+              <w:br/>
+            </w:r>
+            <w:r>
+              <w:rPr>
+                <w:color w:val="000000"/>
+                <w:sz w:val="21"/>
+              </w:rPr>
+              <w:t>Both plant profiles are now linked to this place, ready to explore and compare.</w:t>
+            </w:r>
+          </w:p>
+          <w:p>
+            <w:pPr>
+              <w:keepLines/>
+              <w:spacing w:after="140"/>
+            </w:pPr>
+            <w:r>
+              <w:rPr>
+                <w:b/>
+                <w:color w:val="000000"/>
+                <w:sz w:val="21"/>
+              </w:rPr>
+              <w:t>Control panel info</w:t>
+              <w:br/>
+            </w:r>
+            <w:r>
+              <w:rPr>
+                <w:color w:val="000000"/>
+                <w:sz w:val="21"/>
+              </w:rPr>
+              <w:t>Moringa’s Plant Profile opens when its Orb is selected, with its own image and information path.</w:t>
+            </w:r>
+          </w:p>
+          <w:p>
+            <w:pPr>
+              <w:keepLines/>
               <w:spacing w:after="60"/>
+            </w:pPr>
+            <w:r>
               <w:rPr>
                 <w:b/>
-              </w:rPr>
-            </w:pPr>
-            <w:r>
-              <w:rPr>
-                <w:b/>
-                <w:bCs/>
-              </w:rPr>
-              <w:t>Both plant profiles are now linked to this place, ready to explore and compare.</w:t>
+                <w:color w:val="000000"/>
+                <w:sz w:val="21"/>
+              </w:rPr>
+              <w:t>HINTS</w:t>
+              <w:br/>
+            </w:r>
+            <w:r>
+              <w:rPr>
+                <w:color w:val="000000"/>
+                <w:sz w:val="21"/>
+              </w:rPr>
+              <w:t>Aim at and select the Moringa Plant Orb to read its profile.</w:t>
             </w:r>
           </w:p>
         </w:tc>
@@ -1161,11 +2198,12 @@
       <w:tr>
         <w:trPr>
           <w:tblCellSpacing w:w="15" w:type="dxa"/>
+          <w:cantSplit/>
         </w:trPr>
         <w:tc>
           <w:tcPr>
             <w:tcW w:w="0" w:type="auto"/>
-            <w:vAlign w:val="center"/>
+            <w:vAlign w:val="top"/>
             <w:hideMark/>
           </w:tcPr>
           <w:p>
@@ -1178,6 +2216,8 @@
             <w:r>
               <w:rPr>
                 <w:b/>
+                <w:color w:val="000000"/>
+                <w:sz w:val="20"/>
               </w:rPr>
               <w:t>ELEMENTS 1.14</w:t>
             </w:r>
@@ -1186,22 +2226,78 @@
         <w:tc>
           <w:tcPr>
             <w:tcW w:w="0" w:type="auto"/>
-            <w:vAlign w:val="center"/>
+            <w:vAlign w:val="top"/>
             <w:hideMark/>
           </w:tcPr>
           <w:p>
             <w:pPr>
+              <w:keepLines/>
+              <w:spacing w:after="140"/>
+            </w:pPr>
+            <w:r>
+              <w:rPr>
+                <w:color w:val="000000"/>
+              </w:rPr>
+            </w:r>
+            <w:r>
+              <w:rPr>
+                <w:b/>
+                <w:color w:val="000000"/>
+                <w:sz w:val="21"/>
+              </w:rPr>
+              <w:t>Main screen</w:t>
+              <w:br/>
+            </w:r>
+            <w:r>
+              <w:rPr>
+                <w:color w:val="000000"/>
+                <w:sz w:val="21"/>
+              </w:rPr>
+              <w:t>What do you notice in the actual landscape?</w:t>
+            </w:r>
+          </w:p>
+          <w:p>
+            <w:pPr>
+              <w:keepLines/>
+              <w:spacing w:after="140"/>
+            </w:pPr>
+            <w:r>
+              <w:rPr>
+                <w:b/>
+                <w:color w:val="000000"/>
+                <w:sz w:val="21"/>
+              </w:rPr>
+              <w:t>Control panel info</w:t>
+              <w:br/>
+            </w:r>
+            <w:r>
+              <w:rPr>
+                <w:color w:val="000000"/>
+                <w:sz w:val="21"/>
+              </w:rPr>
+              <w:t>Selected plant information remains available until the Note is selected.</w:t>
+            </w:r>
+          </w:p>
+          <w:p>
+            <w:pPr>
+              <w:keepLines/>
               <w:spacing w:after="60"/>
+            </w:pPr>
+            <w:r>
               <w:rPr>
                 <w:b/>
-              </w:rPr>
-            </w:pPr>
-            <w:r>
-              <w:rPr>
-                <w:b/>
-                <w:bCs/>
-              </w:rPr>
-              <w:t>What do you notice in the actual landscape?</w:t>
+                <w:color w:val="000000"/>
+                <w:sz w:val="21"/>
+              </w:rPr>
+              <w:t>HINTS</w:t>
+              <w:br/>
+            </w:r>
+            <w:r>
+              <w:rPr>
+                <w:color w:val="000000"/>
+                <w:sz w:val="21"/>
+              </w:rPr>
+              <w:t>No fixed hint at this step; Continue advances to Note placement.</w:t>
             </w:r>
           </w:p>
         </w:tc>
@@ -1209,11 +2305,12 @@
       <w:tr>
         <w:trPr>
           <w:tblCellSpacing w:w="15" w:type="dxa"/>
+          <w:cantSplit/>
         </w:trPr>
         <w:tc>
           <w:tcPr>
             <w:tcW w:w="0" w:type="auto"/>
-            <w:vAlign w:val="center"/>
+            <w:vAlign w:val="top"/>
             <w:hideMark/>
           </w:tcPr>
           <w:p>
@@ -1226,6 +2323,8 @@
             <w:r>
               <w:rPr>
                 <w:b/>
+                <w:color w:val="000000"/>
+                <w:sz w:val="20"/>
               </w:rPr>
               <w:t>ELEMENTS 1.15</w:t>
             </w:r>
@@ -1234,22 +2333,78 @@
         <w:tc>
           <w:tcPr>
             <w:tcW w:w="0" w:type="auto"/>
-            <w:vAlign w:val="center"/>
+            <w:vAlign w:val="top"/>
             <w:hideMark/>
           </w:tcPr>
           <w:p>
             <w:pPr>
+              <w:keepLines/>
+              <w:spacing w:after="140"/>
+            </w:pPr>
+            <w:r>
+              <w:rPr>
+                <w:color w:val="000000"/>
+              </w:rPr>
+            </w:r>
+            <w:r>
+              <w:rPr>
+                <w:b/>
+                <w:color w:val="000000"/>
+                <w:sz w:val="21"/>
+              </w:rPr>
+              <w:t>Main screen</w:t>
+              <w:br/>
+            </w:r>
+            <w:r>
+              <w:rPr>
+                <w:color w:val="000000"/>
+                <w:sz w:val="21"/>
+              </w:rPr>
+              <w:t>Create a Note to record an observation.</w:t>
+            </w:r>
+          </w:p>
+          <w:p>
+            <w:pPr>
+              <w:keepLines/>
+              <w:spacing w:after="140"/>
+            </w:pPr>
+            <w:r>
+              <w:rPr>
+                <w:b/>
+                <w:color w:val="000000"/>
+                <w:sz w:val="21"/>
+              </w:rPr>
+              <w:t>Control panel info</w:t>
+              <w:br/>
+            </w:r>
+            <w:r>
+              <w:rPr>
+                <w:color w:val="000000"/>
+                <w:sz w:val="21"/>
+              </w:rPr>
+              <w:t>Placement guidance remains available. No new fixed body text is shown.</w:t>
+            </w:r>
+          </w:p>
+          <w:p>
+            <w:pPr>
+              <w:keepLines/>
               <w:spacing w:after="60"/>
+            </w:pPr>
+            <w:r>
               <w:rPr>
                 <w:b/>
-              </w:rPr>
-            </w:pPr>
-            <w:r>
-              <w:rPr>
-                <w:b/>
-                <w:bCs/>
-              </w:rPr>
-              <w:t>Create a Note to record an observation.</w:t>
+                <w:color w:val="000000"/>
+                <w:sz w:val="21"/>
+              </w:rPr>
+              <w:t>HINTS</w:t>
+              <w:br/>
+            </w:r>
+            <w:r>
+              <w:rPr>
+                <w:color w:val="000000"/>
+                <w:sz w:val="21"/>
+              </w:rPr>
+              <w:t>Use Continue below.</w:t>
             </w:r>
           </w:p>
         </w:tc>
@@ -1257,11 +2412,12 @@
       <w:tr>
         <w:trPr>
           <w:tblCellSpacing w:w="15" w:type="dxa"/>
+          <w:cantSplit/>
         </w:trPr>
         <w:tc>
           <w:tcPr>
             <w:tcW w:w="0" w:type="auto"/>
-            <w:vAlign w:val="center"/>
+            <w:vAlign w:val="top"/>
             <w:hideMark/>
           </w:tcPr>
           <w:p>
@@ -1274,6 +2430,8 @@
             <w:r>
               <w:rPr>
                 <w:b/>
+                <w:color w:val="000000"/>
+                <w:sz w:val="20"/>
               </w:rPr>
               <w:t>ELEMENTS 1.17</w:t>
             </w:r>
@@ -1282,22 +2440,78 @@
         <w:tc>
           <w:tcPr>
             <w:tcW w:w="0" w:type="auto"/>
-            <w:vAlign w:val="center"/>
+            <w:vAlign w:val="top"/>
             <w:hideMark/>
           </w:tcPr>
           <w:p>
             <w:pPr>
+              <w:keepLines/>
+              <w:spacing w:after="140"/>
+            </w:pPr>
+            <w:r>
+              <w:rPr>
+                <w:color w:val="000000"/>
+              </w:rPr>
+            </w:r>
+            <w:r>
+              <w:rPr>
+                <w:b/>
+                <w:color w:val="000000"/>
+                <w:sz w:val="21"/>
+              </w:rPr>
+              <w:t>Main screen</w:t>
+              <w:br/>
+            </w:r>
+            <w:r>
+              <w:rPr>
+                <w:color w:val="000000"/>
+                <w:sz w:val="21"/>
+              </w:rPr>
+              <w:t>Your Note now belongs to this location. It can hold an observation, image, memory or task.</w:t>
+            </w:r>
+          </w:p>
+          <w:p>
+            <w:pPr>
+              <w:keepLines/>
+              <w:spacing w:after="140"/>
+            </w:pPr>
+            <w:r>
+              <w:rPr>
+                <w:b/>
+                <w:color w:val="000000"/>
+                <w:sz w:val="21"/>
+              </w:rPr>
+              <w:t>Control panel info</w:t>
+              <w:br/>
+            </w:r>
+            <w:r>
+              <w:rPr>
+                <w:color w:val="000000"/>
+                <w:sz w:val="21"/>
+              </w:rPr>
+              <w:t>Select the Note to view its current template. Selecting another example updates the Note at the same location.</w:t>
+            </w:r>
+          </w:p>
+          <w:p>
+            <w:pPr>
+              <w:keepLines/>
               <w:spacing w:after="60"/>
+            </w:pPr>
+            <w:r>
               <w:rPr>
                 <w:b/>
-              </w:rPr>
-            </w:pPr>
-            <w:r>
-              <w:rPr>
-                <w:b/>
-                <w:bCs/>
-              </w:rPr>
-              <w:t>Your Note now belongs to this location. It can hold an observation, image, memory or task.</w:t>
+                <w:color w:val="000000"/>
+                <w:sz w:val="21"/>
+              </w:rPr>
+              <w:t>HINTS</w:t>
+              <w:br/>
+            </w:r>
+            <w:r>
+              <w:rPr>
+                <w:color w:val="000000"/>
+                <w:sz w:val="21"/>
+              </w:rPr>
+              <w:t>Select the note to see what changed.</w:t>
             </w:r>
           </w:p>
         </w:tc>
@@ -1305,11 +2519,12 @@
       <w:tr>
         <w:trPr>
           <w:tblCellSpacing w:w="15" w:type="dxa"/>
+          <w:cantSplit/>
         </w:trPr>
         <w:tc>
           <w:tcPr>
             <w:tcW w:w="0" w:type="auto"/>
-            <w:vAlign w:val="center"/>
+            <w:vAlign w:val="top"/>
             <w:hideMark/>
           </w:tcPr>
           <w:p>
@@ -1322,6 +2537,8 @@
             <w:r>
               <w:rPr>
                 <w:b/>
+                <w:color w:val="000000"/>
+                <w:sz w:val="20"/>
               </w:rPr>
               <w:t>ELEMENTS 1.18</w:t>
             </w:r>
@@ -1330,22 +2547,78 @@
         <w:tc>
           <w:tcPr>
             <w:tcW w:w="0" w:type="auto"/>
-            <w:vAlign w:val="center"/>
+            <w:vAlign w:val="top"/>
             <w:hideMark/>
           </w:tcPr>
           <w:p>
             <w:pPr>
+              <w:keepLines/>
+              <w:spacing w:after="140"/>
+            </w:pPr>
+            <w:r>
+              <w:rPr>
+                <w:color w:val="000000"/>
+              </w:rPr>
+            </w:r>
+            <w:r>
+              <w:rPr>
+                <w:b/>
+                <w:color w:val="000000"/>
+                <w:sz w:val="21"/>
+              </w:rPr>
+              <w:t>Main screen</w:t>
+              <w:br/>
+            </w:r>
+            <w:r>
+              <w:rPr>
+                <w:color w:val="000000"/>
+                <w:sz w:val="21"/>
+              </w:rPr>
+              <w:t>This Totem introduces the Area and points to nearby content. Use Show Signs to reveal its directions, or Fade to reduce its visibility.</w:t>
+            </w:r>
+          </w:p>
+          <w:p>
+            <w:pPr>
+              <w:keepLines/>
+              <w:spacing w:after="140"/>
+            </w:pPr>
+            <w:r>
+              <w:rPr>
+                <w:b/>
+                <w:color w:val="000000"/>
+                <w:sz w:val="21"/>
+              </w:rPr>
+              <w:t>Control panel info</w:t>
+              <w:br/>
+            </w:r>
+            <w:r>
+              <w:rPr>
+                <w:color w:val="000000"/>
+                <w:sz w:val="21"/>
+              </w:rPr>
+              <w:t>The matching Totem illustration opens independently. The Control panel remains available for the selected Totem or sign.</w:t>
+            </w:r>
+          </w:p>
+          <w:p>
+            <w:pPr>
+              <w:keepLines/>
               <w:spacing w:after="60"/>
+            </w:pPr>
+            <w:r>
               <w:rPr>
                 <w:b/>
-              </w:rPr>
-            </w:pPr>
-            <w:r>
-              <w:rPr>
-                <w:b/>
-                <w:bCs/>
-              </w:rPr>
-              <w:t>This Totem introduces the Area and points to nearby content. Use Show Signs to reveal its directions, or Fade to reduce its visibility.</w:t>
+                <w:color w:val="000000"/>
+                <w:sz w:val="21"/>
+              </w:rPr>
+              <w:t>HINTS</w:t>
+              <w:br/>
+            </w:r>
+            <w:r>
+              <w:rPr>
+                <w:color w:val="000000"/>
+                <w:sz w:val="21"/>
+              </w:rPr>
+              <w:t>Use Show Totem below. Check the Totem base against the real floor. Settings → Floor height adjustment corrects its height.</w:t>
             </w:r>
           </w:p>
         </w:tc>
@@ -1353,11 +2626,12 @@
       <w:tr>
         <w:trPr>
           <w:tblCellSpacing w:w="15" w:type="dxa"/>
+          <w:cantSplit/>
         </w:trPr>
         <w:tc>
           <w:tcPr>
             <w:tcW w:w="0" w:type="auto"/>
-            <w:vAlign w:val="center"/>
+            <w:vAlign w:val="top"/>
             <w:hideMark/>
           </w:tcPr>
           <w:p>
@@ -1370,6 +2644,8 @@
             <w:r>
               <w:rPr>
                 <w:b/>
+                <w:color w:val="000000"/>
+                <w:sz w:val="20"/>
               </w:rPr>
               <w:t>ELEMENTS 1.21</w:t>
             </w:r>
@@ -1378,22 +2654,78 @@
         <w:tc>
           <w:tcPr>
             <w:tcW w:w="0" w:type="auto"/>
-            <w:vAlign w:val="center"/>
+            <w:vAlign w:val="top"/>
             <w:hideMark/>
           </w:tcPr>
           <w:p>
             <w:pPr>
+              <w:keepLines/>
+              <w:spacing w:after="140"/>
+            </w:pPr>
+            <w:r>
+              <w:rPr>
+                <w:color w:val="000000"/>
+              </w:rPr>
+            </w:r>
+            <w:r>
+              <w:rPr>
+                <w:b/>
+                <w:color w:val="000000"/>
+                <w:sz w:val="21"/>
+              </w:rPr>
+              <w:t>Main screen</w:t>
+              <w:br/>
+            </w:r>
+            <w:r>
+              <w:rPr>
+                <w:color w:val="000000"/>
+                <w:sz w:val="21"/>
+              </w:rPr>
+              <w:t>A route connects the two Areas. Each keeps its own plants and Notes.</w:t>
+            </w:r>
+          </w:p>
+          <w:p>
+            <w:pPr>
+              <w:keepLines/>
+              <w:spacing w:after="140"/>
+            </w:pPr>
+            <w:r>
+              <w:rPr>
+                <w:b/>
+                <w:color w:val="000000"/>
+                <w:sz w:val="21"/>
+              </w:rPr>
+              <w:t>Control panel info</w:t>
+              <w:br/>
+            </w:r>
+            <w:r>
+              <w:rPr>
+                <w:color w:val="000000"/>
+                <w:sz w:val="21"/>
+              </w:rPr>
+              <w:t>The selected Totem or sign information remains available; each Area keeps its own local content.</w:t>
+            </w:r>
+          </w:p>
+          <w:p>
+            <w:pPr>
+              <w:keepLines/>
               <w:spacing w:after="60"/>
+            </w:pPr>
+            <w:r>
               <w:rPr>
                 <w:b/>
-              </w:rPr>
-            </w:pPr>
-            <w:r>
-              <w:rPr>
-                <w:b/>
-                <w:bCs/>
-              </w:rPr>
-              <w:t>A route connects the two Areas. Each keeps its own plants and Notes.</w:t>
+                <w:color w:val="000000"/>
+                <w:sz w:val="21"/>
+              </w:rPr>
+              <w:t>HINTS</w:t>
+              <w:br/>
+            </w:r>
+            <w:r>
+              <w:rPr>
+                <w:color w:val="000000"/>
+                <w:sz w:val="21"/>
+              </w:rPr>
+              <w:t>Use the displayed Continue action below.</w:t>
             </w:r>
           </w:p>
         </w:tc>
@@ -1401,11 +2733,12 @@
       <w:tr>
         <w:trPr>
           <w:tblCellSpacing w:w="15" w:type="dxa"/>
+          <w:cantSplit/>
         </w:trPr>
         <w:tc>
           <w:tcPr>
             <w:tcW w:w="0" w:type="auto"/>
-            <w:vAlign w:val="center"/>
+            <w:vAlign w:val="top"/>
             <w:hideMark/>
           </w:tcPr>
           <w:p>
@@ -1418,6 +2751,8 @@
             <w:r>
               <w:rPr>
                 <w:b/>
+                <w:color w:val="000000"/>
+                <w:sz w:val="20"/>
               </w:rPr>
               <w:t>ELEMENTS 1.22</w:t>
             </w:r>
@@ -1426,22 +2761,78 @@
         <w:tc>
           <w:tcPr>
             <w:tcW w:w="0" w:type="auto"/>
-            <w:vAlign w:val="center"/>
+            <w:vAlign w:val="top"/>
             <w:hideMark/>
           </w:tcPr>
           <w:p>
             <w:pPr>
+              <w:keepLines/>
+              <w:spacing w:after="140"/>
+            </w:pPr>
+            <w:r>
+              <w:rPr>
+                <w:color w:val="000000"/>
+              </w:rPr>
+            </w:r>
+            <w:r>
+              <w:rPr>
+                <w:b/>
+                <w:color w:val="000000"/>
+                <w:sz w:val="21"/>
+              </w:rPr>
+              <w:t>Main screen</w:t>
+              <w:br/>
+            </w:r>
+            <w:r>
+              <w:rPr>
+                <w:color w:val="000000"/>
+                <w:sz w:val="21"/>
+              </w:rPr>
+              <w:t>Linked Areas can form a garden tour, a learning trail or a route through a working landscape.</w:t>
+            </w:r>
+          </w:p>
+          <w:p>
+            <w:pPr>
+              <w:keepLines/>
+              <w:spacing w:after="140"/>
+            </w:pPr>
+            <w:r>
+              <w:rPr>
+                <w:b/>
+                <w:color w:val="000000"/>
+                <w:sz w:val="21"/>
+              </w:rPr>
+              <w:t>Control panel info</w:t>
+              <w:br/>
+            </w:r>
+            <w:r>
+              <w:rPr>
+                <w:color w:val="000000"/>
+                <w:sz w:val="21"/>
+              </w:rPr>
+              <w:t>The linked Areas illustration opens independently. No additional fixed Control panel paragraph is shown.</w:t>
+            </w:r>
+          </w:p>
+          <w:p>
+            <w:pPr>
+              <w:keepLines/>
               <w:spacing w:after="60"/>
+            </w:pPr>
+            <w:r>
               <w:rPr>
                 <w:b/>
-              </w:rPr>
-            </w:pPr>
-            <w:r>
-              <w:rPr>
-                <w:b/>
-                <w:bCs/>
-              </w:rPr>
-              <w:t>Linked Areas can form a garden tour, a learning trail or a route through a working landscape.</w:t>
+                <w:color w:val="000000"/>
+                <w:sz w:val="21"/>
+              </w:rPr>
+              <w:t>HINTS</w:t>
+              <w:br/>
+            </w:r>
+            <w:r>
+              <w:rPr>
+                <w:color w:val="000000"/>
+                <w:sz w:val="21"/>
+              </w:rPr>
+              <w:t>Use Connect plant knowledge to learning below.</w:t>
             </w:r>
           </w:p>
         </w:tc>
@@ -1449,11 +2840,12 @@
       <w:tr>
         <w:trPr>
           <w:tblCellSpacing w:w="15" w:type="dxa"/>
+          <w:cantSplit/>
         </w:trPr>
         <w:tc>
           <w:tcPr>
             <w:tcW w:w="0" w:type="auto"/>
-            <w:vAlign w:val="center"/>
+            <w:vAlign w:val="top"/>
             <w:hideMark/>
           </w:tcPr>
           <w:p>
@@ -1466,6 +2858,8 @@
             <w:r>
               <w:rPr>
                 <w:b/>
+                <w:color w:val="000000"/>
+                <w:sz w:val="20"/>
               </w:rPr>
               <w:t>LEARNING 1.7</w:t>
             </w:r>
@@ -1474,22 +2868,78 @@
         <w:tc>
           <w:tcPr>
             <w:tcW w:w="0" w:type="auto"/>
-            <w:vAlign w:val="center"/>
+            <w:vAlign w:val="top"/>
             <w:hideMark/>
           </w:tcPr>
           <w:p>
             <w:pPr>
+              <w:keepLines/>
+              <w:spacing w:after="140"/>
+            </w:pPr>
+            <w:r>
+              <w:rPr>
+                <w:color w:val="000000"/>
+              </w:rPr>
+            </w:r>
+            <w:r>
+              <w:rPr>
+                <w:b/>
+                <w:color w:val="000000"/>
+                <w:sz w:val="21"/>
+              </w:rPr>
+              <w:t>Main screen</w:t>
+              <w:br/>
+            </w:r>
+            <w:r>
+              <w:rPr>
+                <w:color w:val="000000"/>
+                <w:sz w:val="21"/>
+              </w:rPr>
+              <w:t>Choose a learning pathway and explore the questions within it.</w:t>
+            </w:r>
+          </w:p>
+          <w:p>
+            <w:pPr>
+              <w:keepLines/>
+              <w:spacing w:after="140"/>
+            </w:pPr>
+            <w:r>
+              <w:rPr>
+                <w:b/>
+                <w:color w:val="000000"/>
+                <w:sz w:val="21"/>
+              </w:rPr>
+              <w:t>Control panel info</w:t>
+              <w:br/>
+            </w:r>
+            <w:r>
+              <w:rPr>
+                <w:color w:val="000000"/>
+                <w:sz w:val="21"/>
+              </w:rPr>
+              <w:t>The four archetypes are starting points for different ways of learning. Select an archetype to open its pathway, then follow the connected cells that become relevant.</w:t>
+            </w:r>
+          </w:p>
+          <w:p>
+            <w:pPr>
+              <w:keepLines/>
               <w:spacing w:after="60"/>
+            </w:pPr>
+            <w:r>
               <w:rPr>
                 <w:b/>
-              </w:rPr>
-            </w:pPr>
-            <w:r>
-              <w:rPr>
-                <w:b/>
-                <w:bCs/>
-              </w:rPr>
-              <w:t>Choose a learning pathway and explore the questions within it.</w:t>
+                <w:color w:val="000000"/>
+                <w:sz w:val="21"/>
+              </w:rPr>
+              <w:t>HINTS</w:t>
+              <w:br/>
+            </w:r>
+            <w:r>
+              <w:rPr>
+                <w:color w:val="000000"/>
+                <w:sz w:val="21"/>
+              </w:rPr>
+              <w:t>Select an archetype to explore its connected learning cells.</w:t>
             </w:r>
           </w:p>
         </w:tc>
@@ -1497,11 +2947,12 @@
       <w:tr>
         <w:trPr>
           <w:tblCellSpacing w:w="15" w:type="dxa"/>
+          <w:cantSplit/>
         </w:trPr>
         <w:tc>
           <w:tcPr>
             <w:tcW w:w="0" w:type="auto"/>
-            <w:vAlign w:val="center"/>
+            <w:vAlign w:val="top"/>
             <w:hideMark/>
           </w:tcPr>
           <w:p>
@@ -1514,6 +2965,8 @@
             <w:r>
               <w:rPr>
                 <w:b/>
+                <w:color w:val="000000"/>
+                <w:sz w:val="20"/>
               </w:rPr>
               <w:t>LEARNING 1.8</w:t>
             </w:r>
@@ -1522,22 +2975,78 @@
         <w:tc>
           <w:tcPr>
             <w:tcW w:w="0" w:type="auto"/>
-            <w:vAlign w:val="center"/>
+            <w:vAlign w:val="top"/>
             <w:hideMark/>
           </w:tcPr>
           <w:p>
             <w:pPr>
+              <w:keepLines/>
+              <w:spacing w:after="140"/>
+            </w:pPr>
+            <w:r>
+              <w:rPr>
+                <w:color w:val="000000"/>
+              </w:rPr>
+            </w:r>
+            <w:r>
+              <w:rPr>
+                <w:b/>
+                <w:color w:val="000000"/>
+                <w:sz w:val="21"/>
+              </w:rPr>
+              <w:t>Main screen</w:t>
+              <w:br/>
+            </w:r>
+            <w:r>
+              <w:rPr>
+                <w:color w:val="000000"/>
+                <w:sz w:val="21"/>
+              </w:rPr>
+              <w:t>Connect a plant characteristic to a learning question to explore it further.</w:t>
+            </w:r>
+          </w:p>
+          <w:p>
+            <w:pPr>
+              <w:keepLines/>
+              <w:spacing w:after="140"/>
+            </w:pPr>
+            <w:r>
+              <w:rPr>
+                <w:b/>
+                <w:color w:val="000000"/>
+                <w:sz w:val="21"/>
+              </w:rPr>
+              <w:t>Control panel info</w:t>
+              <w:br/>
+            </w:r>
+            <w:r>
+              <w:rPr>
+                <w:color w:val="000000"/>
+                <w:sz w:val="21"/>
+              </w:rPr>
+              <w:t>Connection guidance names the source plant cell and target learning cell. It changes as you select the source, hold the target and complete the connection.</w:t>
+            </w:r>
+          </w:p>
+          <w:p>
+            <w:pPr>
+              <w:keepLines/>
               <w:spacing w:after="60"/>
+            </w:pPr>
+            <w:r>
               <w:rPr>
                 <w:b/>
-              </w:rPr>
-            </w:pPr>
-            <w:r>
-              <w:rPr>
-                <w:b/>
-                <w:bCs/>
-              </w:rPr>
-              <w:t>Connect a plant characteristic to a learning question to explore it further.</w:t>
+                <w:color w:val="000000"/>
+                <w:sz w:val="21"/>
+              </w:rPr>
+              <w:t>HINTS</w:t>
+              <w:br/>
+            </w:r>
+            <w:r>
+              <w:rPr>
+                <w:color w:val="000000"/>
+                <w:sz w:val="21"/>
+              </w:rPr>
+              <w:t>Select the highlighted plant information cell, then hold the highlighted learning cell until its progress ring completes.</w:t>
             </w:r>
           </w:p>
         </w:tc>
@@ -1545,11 +3054,12 @@
       <w:tr>
         <w:trPr>
           <w:tblCellSpacing w:w="15" w:type="dxa"/>
+          <w:cantSplit/>
         </w:trPr>
         <w:tc>
           <w:tcPr>
             <w:tcW w:w="0" w:type="auto"/>
-            <w:vAlign w:val="center"/>
+            <w:vAlign w:val="top"/>
             <w:hideMark/>
           </w:tcPr>
           <w:p>
@@ -1562,6 +3072,8 @@
             <w:r>
               <w:rPr>
                 <w:b/>
+                <w:color w:val="000000"/>
+                <w:sz w:val="20"/>
               </w:rPr>
               <w:t>LEARNING 1.10</w:t>
             </w:r>
@@ -1570,22 +3082,84 @@
         <w:tc>
           <w:tcPr>
             <w:tcW w:w="0" w:type="auto"/>
-            <w:vAlign w:val="center"/>
+            <w:vAlign w:val="top"/>
             <w:hideMark/>
           </w:tcPr>
           <w:p>
             <w:pPr>
+              <w:keepLines/>
+              <w:spacing w:after="140"/>
+            </w:pPr>
+            <w:r>
+              <w:rPr>
+                <w:color w:val="000000"/>
+              </w:rPr>
+            </w:r>
+            <w:r>
+              <w:rPr>
+                <w:b/>
+                <w:color w:val="000000"/>
+                <w:sz w:val="21"/>
+              </w:rPr>
+              <w:t>Main screen</w:t>
+              <w:br/>
+            </w:r>
+            <w:r>
+              <w:rPr>
+                <w:color w:val="000000"/>
+                <w:sz w:val="21"/>
+              </w:rPr>
+              <w:t>Your connection opens a new question. Follow it further, or try another connection.</w:t>
+            </w:r>
+          </w:p>
+          <w:p>
+            <w:pPr>
+              <w:keepLines/>
+              <w:spacing w:after="140"/>
+            </w:pPr>
+            <w:r>
+              <w:rPr>
+                <w:b/>
+                <w:color w:val="000000"/>
+                <w:sz w:val="21"/>
+              </w:rPr>
+              <w:t>Control panel info</w:t>
+              <w:br/>
+            </w:r>
+            <w:r>
+              <w:rPr>
+                <w:color w:val="000000"/>
+                <w:sz w:val="21"/>
+              </w:rPr>
+              <w:t>The {sourceTitle} cell is selected. Aim at LIMO’s {targetTitle} cell and hold until its progress ring completes. Release early to cancel and try again.</w:t>
+              <w:br/>
+              <w:br/>
+              <w:t>{explanation}</w:t>
+              <w:br/>
+              <w:br/>
+              <w:t>In this place: {fieldQuestion}</w:t>
+            </w:r>
+          </w:p>
+          <w:p>
+            <w:pPr>
+              <w:keepLines/>
               <w:spacing w:after="60"/>
+            </w:pPr>
+            <w:r>
               <w:rPr>
                 <w:b/>
-              </w:rPr>
-            </w:pPr>
-            <w:r>
-              <w:rPr>
-                <w:b/>
-                <w:bCs/>
-              </w:rPr>
-              <w:t>Your connection opens a new question. Follow it further, or try another connection.</w:t>
+                <w:color w:val="000000"/>
+                <w:sz w:val="21"/>
+              </w:rPr>
+              <w:t>HINTS</w:t>
+              <w:br/>
+            </w:r>
+            <w:r>
+              <w:rPr>
+                <w:color w:val="000000"/>
+                <w:sz w:val="21"/>
+              </w:rPr>
+              <w:t>Select {targetTitle} in LIMO to continue.</w:t>
             </w:r>
           </w:p>
         </w:tc>
@@ -1593,11 +3167,12 @@
       <w:tr>
         <w:trPr>
           <w:tblCellSpacing w:w="15" w:type="dxa"/>
+          <w:cantSplit/>
         </w:trPr>
         <w:tc>
           <w:tcPr>
             <w:tcW w:w="0" w:type="auto"/>
-            <w:vAlign w:val="center"/>
+            <w:vAlign w:val="top"/>
             <w:hideMark/>
           </w:tcPr>
           <w:p>
@@ -1610,6 +3185,8 @@
             <w:r>
               <w:rPr>
                 <w:b/>
+                <w:color w:val="000000"/>
+                <w:sz w:val="20"/>
               </w:rPr>
               <w:t>LEARNING 1.12</w:t>
             </w:r>
@@ -1618,22 +3195,78 @@
         <w:tc>
           <w:tcPr>
             <w:tcW w:w="0" w:type="auto"/>
-            <w:vAlign w:val="center"/>
+            <w:vAlign w:val="top"/>
             <w:hideMark/>
           </w:tcPr>
           <w:p>
             <w:pPr>
+              <w:keepLines/>
+              <w:spacing w:after="140"/>
+            </w:pPr>
+            <w:r>
+              <w:rPr>
+                <w:color w:val="000000"/>
+              </w:rPr>
+            </w:r>
+            <w:r>
+              <w:rPr>
+                <w:b/>
+                <w:color w:val="000000"/>
+                <w:sz w:val="21"/>
+              </w:rPr>
+              <w:t>Main screen</w:t>
+              <w:br/>
+            </w:r>
+            <w:r>
+              <w:rPr>
+                <w:color w:val="000000"/>
+                <w:sz w:val="21"/>
+              </w:rPr>
+              <w:t>Take this question back to the landscape. What could you observe here to investigate it?</w:t>
+            </w:r>
+          </w:p>
+          <w:p>
+            <w:pPr>
+              <w:keepLines/>
+              <w:spacing w:after="140"/>
+            </w:pPr>
+            <w:r>
+              <w:rPr>
+                <w:b/>
+                <w:color w:val="000000"/>
+                <w:sz w:val="21"/>
+              </w:rPr>
+              <w:t>Control panel info</w:t>
+              <w:br/>
+            </w:r>
+            <w:r>
+              <w:rPr>
+                <w:color w:val="000000"/>
+                <w:sz w:val="21"/>
+              </w:rPr>
+              <w:t>The selected learning cell supplies its own guidance. No additional fixed Control panel paragraph is shown.</w:t>
+            </w:r>
+          </w:p>
+          <w:p>
+            <w:pPr>
+              <w:keepLines/>
               <w:spacing w:after="60"/>
+            </w:pPr>
+            <w:r>
               <w:rPr>
                 <w:b/>
-              </w:rPr>
-            </w:pPr>
-            <w:r>
-              <w:rPr>
-                <w:b/>
-                <w:bCs/>
-              </w:rPr>
-              <w:t>Take this question back to the landscape. What could you observe here to investigate it?</w:t>
+                <w:color w:val="000000"/>
+                <w:sz w:val="21"/>
+              </w:rPr>
+              <w:t>HINTS</w:t>
+              <w:br/>
+            </w:r>
+            <w:r>
+              <w:rPr>
+                <w:color w:val="000000"/>
+                <w:sz w:val="21"/>
+              </w:rPr>
+              <w:t>Return your attention to the real landscape and the selected question.</w:t>
             </w:r>
           </w:p>
         </w:tc>
@@ -1641,11 +3274,12 @@
       <w:tr>
         <w:trPr>
           <w:tblCellSpacing w:w="15" w:type="dxa"/>
+          <w:cantSplit/>
         </w:trPr>
         <w:tc>
           <w:tcPr>
             <w:tcW w:w="0" w:type="auto"/>
-            <w:vAlign w:val="center"/>
+            <w:vAlign w:val="top"/>
             <w:hideMark/>
           </w:tcPr>
           <w:p>
@@ -1658,6 +3292,8 @@
             <w:r>
               <w:rPr>
                 <w:b/>
+                <w:color w:val="000000"/>
+                <w:sz w:val="20"/>
               </w:rPr>
               <w:t>CLOSURE 1.1</w:t>
             </w:r>
@@ -1666,22 +3302,78 @@
         <w:tc>
           <w:tcPr>
             <w:tcW w:w="0" w:type="auto"/>
-            <w:vAlign w:val="center"/>
+            <w:vAlign w:val="top"/>
             <w:hideMark/>
           </w:tcPr>
           <w:p>
             <w:pPr>
+              <w:keepLines/>
+              <w:spacing w:after="140"/>
+            </w:pPr>
+            <w:r>
+              <w:rPr>
+                <w:color w:val="000000"/>
+              </w:rPr>
+            </w:r>
+            <w:r>
+              <w:rPr>
+                <w:b/>
+                <w:color w:val="000000"/>
+                <w:sz w:val="21"/>
+              </w:rPr>
+              <w:t>Main screen</w:t>
+              <w:br/>
+            </w:r>
+            <w:r>
+              <w:rPr>
+                <w:color w:val="000000"/>
+                <w:sz w:val="21"/>
+              </w:rPr>
+              <w:t>Thank you for exploring NourishlandXR. You’ve connected two plants, an observation and two Areas — the beginnings of a living map that can grow with the place.</w:t>
+            </w:r>
+          </w:p>
+          <w:p>
+            <w:pPr>
+              <w:keepLines/>
+              <w:spacing w:after="140"/>
+            </w:pPr>
+            <w:r>
+              <w:rPr>
+                <w:b/>
+                <w:color w:val="000000"/>
+                <w:sz w:val="21"/>
+              </w:rPr>
+              <w:t>Control panel info</w:t>
+              <w:br/>
+            </w:r>
+            <w:r>
+              <w:rPr>
+                <w:color w:val="000000"/>
+                <w:sz w:val="21"/>
+              </w:rPr>
+              <w:t>The last selected information remains available until Finish demo returns to the welcome screen.</w:t>
+            </w:r>
+          </w:p>
+          <w:p>
+            <w:pPr>
+              <w:keepLines/>
               <w:spacing w:after="60"/>
+            </w:pPr>
+            <w:r>
               <w:rPr>
                 <w:b/>
-              </w:rPr>
-            </w:pPr>
-            <w:r>
-              <w:rPr>
-                <w:b/>
-                <w:bCs/>
-              </w:rPr>
-              <w:t>Thank you for exploring NourishlandXR. You’ve connected two plants, an observation and two Areas — the beginnings of a living map that can grow with the place.</w:t>
+                <w:color w:val="000000"/>
+                <w:sz w:val="21"/>
+              </w:rPr>
+              <w:t>HINTS</w:t>
+              <w:br/>
+            </w:r>
+            <w:r>
+              <w:rPr>
+                <w:color w:val="000000"/>
+                <w:sz w:val="21"/>
+              </w:rPr>
+              <w:t>Use Finish demo below.</w:t>
             </w:r>
           </w:p>
         </w:tc>

</xml_diff>

<commit_message>
V0.9293 Align deployment checks with the single Panels opacity slider
</commit_message>
<xml_diff>
--- a/data1/demo.docx
+++ b/data1/demo.docx
@@ -64,7 +64,7 @@
           </w:tcPr>
           <w:p>
             <w:r>
-              <w:t>0.9292</w:t>
+              <w:t>0.9293</w:t>
             </w:r>
           </w:p>
         </w:tc>
@@ -167,7 +167,7 @@
         <w:spacing w:after="60"/>
       </w:pPr>
       <w:r>
-        <w:t>Working review copy for version 0.9292. Every section below includes Main screen, Control panel info and HINTS. Edit these blocks to review each surface without opening the project. Descriptions of hidden or selection-dependent content explain the current behaviour; braces identify text filled from the selected cells. The detailed narrative below is retained as an earlier reference. Word edits are applied to the application in a separate update.</w:t>
+        <w:t>Working review copy for version 0.9293. Every section below includes Main screen, Control panel info and HINTS. Edit these blocks to review each surface without opening the project. Descriptions of hidden or selection-dependent content explain the current behaviour; braces identify text filled from the selected cells. The detailed narrative below is retained as an earlier reference. Word edits are applied to the application in a separate update.</w:t>
       </w:r>
     </w:p>
     <w:p>

</xml_diff>